<commit_message>
Add enterprise spec, README, FRD, user manual, Playwright test suite, and auth harness fixes for UAM
</commit_message>
<xml_diff>
--- a/docs/uat_1-erd.docx
+++ b/docs/uat_1-erd.docx
@@ -140,21 +140,11 @@
           <w:color w:val="1B7A47"/>
           <w:sz w:val="36"/>
         </w:rPr>
-        <w:t>Entity Relationship Diagram — User Access Management (UAM)</w:t>
+        <w:t>User Access Management — Entity Relationship Diagram</w:t>
       </w:r>
     </w:p>
     <w:p/>
     <w:p>
-      <w:r>
-        <w:rPr>
-          <w:rFonts w:ascii="Calibri" w:hAnsi="Calibri"/>
-          <w:b/>
-          <w:i w:val="0"/>
-          <w:color w:val="111827"/>
-          <w:sz w:val="22"/>
-        </w:rPr>
-        <w:t>Application:</w:t>
-      </w:r>
       <w:r>
         <w:rPr>
           <w:rFonts w:ascii="Calibri" w:hAnsi="Calibri"/>
@@ -163,27 +153,7 @@
           <w:color w:val="111827"/>
           <w:sz w:val="22"/>
         </w:rPr>
-        <w:t xml:space="preserve"> User Access Management (UAT_1) · </w:t>
-      </w:r>
-      <w:r>
-        <w:rPr>
-          <w:rFonts w:ascii="Calibri" w:hAnsi="Calibri"/>
-          <w:b/>
-          <w:i w:val="0"/>
-          <w:color w:val="111827"/>
-          <w:sz w:val="22"/>
-        </w:rPr>
-        <w:t>Platform:</w:t>
-      </w:r>
-      <w:r>
-        <w:rPr>
-          <w:rFonts w:ascii="Calibri" w:hAnsi="Calibri"/>
-          <w:b w:val="0"/>
-          <w:i w:val="0"/>
-          <w:color w:val="111827"/>
-          <w:sz w:val="22"/>
-        </w:rPr>
-        <w:t xml:space="preserve"> Appian</w:t>
+        <w:t>*Data model for the User Access Management (UAM) application*</w:t>
       </w:r>
     </w:p>
     <w:p>
@@ -195,7 +165,7 @@
           <w:color w:val="111827"/>
           <w:sz w:val="22"/>
         </w:rPr>
-        <w:t>Data source:</w:t>
+        <w:t>Document date:</w:t>
       </w:r>
       <w:r>
         <w:rPr>
@@ -205,9 +175,51 @@
           <w:color w:val="111827"/>
           <w:sz w:val="22"/>
         </w:rPr>
-        <w:t xml:space="preserve"> MariaDB `UAMS` (all entities are Appian synced records)</w:t>
+        <w:t xml:space="preserve"> 2026-07-28 · </w:t>
+      </w:r>
+      <w:r>
+        <w:rPr>
+          <w:rFonts w:ascii="Calibri" w:hAnsi="Calibri"/>
+          <w:b/>
+          <w:i w:val="0"/>
+          <w:color w:val="111827"/>
+          <w:sz w:val="22"/>
+        </w:rPr>
+        <w:t>Entities:</w:t>
+      </w:r>
+      <w:r>
+        <w:rPr>
+          <w:rFonts w:ascii="Calibri" w:hAnsi="Calibri"/>
+          <w:b w:val="0"/>
+          <w:i w:val="0"/>
+          <w:color w:val="111827"/>
+          <w:sz w:val="22"/>
+        </w:rPr>
+        <w:t xml:space="preserve"> 31 record types · </w:t>
+      </w:r>
+      <w:r>
+        <w:rPr>
+          <w:rFonts w:ascii="Calibri" w:hAnsi="Calibri"/>
+          <w:b/>
+          <w:i w:val="0"/>
+          <w:color w:val="111827"/>
+          <w:sz w:val="22"/>
+        </w:rPr>
+        <w:t>Relationships:</w:t>
+      </w:r>
+      <w:r>
+        <w:rPr>
+          <w:rFonts w:ascii="Calibri" w:hAnsi="Calibri"/>
+          <w:b w:val="0"/>
+          <w:i w:val="0"/>
+          <w:color w:val="111827"/>
+          <w:sz w:val="22"/>
+        </w:rPr>
+        <w:t xml:space="preserve"> 52</w:t>
       </w:r>
     </w:p>
+    <w:p/>
+    <w:p/>
     <w:p/>
     <w:p>
       <w:pPr>
@@ -234,7 +246,7 @@
           <w:color w:val="111827"/>
           <w:sz w:val="22"/>
         </w:rPr>
-        <w:t xml:space="preserve">The UAM data model is organized around three centers of gravity. </w:t>
+        <w:t xml:space="preserve">The UAM data model is organized around three hubs. </w:t>
       </w:r>
       <w:r>
         <w:rPr>
@@ -254,7 +266,7 @@
           <w:color w:val="111827"/>
           <w:sz w:val="22"/>
         </w:rPr>
-        <w:t xml:space="preserve"> is the top-level container: it owns its addresses, contacts, and a self-referencing parent/child hierarchy (via `Organization Hierarchy Data`), and it anchors the mappings to users, teams, and applications. The </w:t>
+        <w:t xml:space="preserve"> is the top-level container: every organization owns addresses, contacts, team mappings, user mappings, and a self-referencing </w:t>
       </w:r>
       <w:r>
         <w:rPr>
@@ -264,7 +276,7 @@
           <w:color w:val="111827"/>
           <w:sz w:val="22"/>
         </w:rPr>
-        <w:t>User ↔ Team ↔ Organization</w:t>
+        <w:t>parent/child hierarchy</w:t>
       </w:r>
       <w:r>
         <w:rPr>
@@ -274,7 +286,120 @@
           <w:color w:val="111827"/>
           <w:sz w:val="22"/>
         </w:rPr>
-        <w:t xml:space="preserve"> access triangle — expressed through the `User Organization`, `User Team`, and `Organization Team` junction tables — captures who belongs where. And the </w:t>
+        <w:t xml:space="preserve"> (modeled through `Organization Hierarchy Data`, which points at Organization twice — once as parent, once as child). </w:t>
+      </w:r>
+      <w:r>
+        <w:rPr>
+          <w:rFonts w:ascii="Calibri" w:hAnsi="Calibri"/>
+          <w:b/>
+          <w:i w:val="0"/>
+          <w:color w:val="111827"/>
+          <w:sz w:val="22"/>
+        </w:rPr>
+        <w:t>Team</w:t>
+      </w:r>
+      <w:r>
+        <w:rPr>
+          <w:rFonts w:ascii="Calibri" w:hAnsi="Calibri"/>
+          <w:b w:val="0"/>
+          <w:i w:val="0"/>
+          <w:color w:val="111827"/>
+          <w:sz w:val="22"/>
+        </w:rPr>
+        <w:t xml:space="preserve"> and </w:t>
+      </w:r>
+      <w:r>
+        <w:rPr>
+          <w:rFonts w:ascii="Calibri" w:hAnsi="Calibri"/>
+          <w:b/>
+          <w:i w:val="0"/>
+          <w:color w:val="111827"/>
+          <w:sz w:val="22"/>
+        </w:rPr>
+        <w:t>User</w:t>
+      </w:r>
+      <w:r>
+        <w:rPr>
+          <w:rFonts w:ascii="Calibri" w:hAnsi="Calibri"/>
+          <w:b w:val="0"/>
+          <w:i w:val="0"/>
+          <w:color w:val="111827"/>
+          <w:sz w:val="22"/>
+        </w:rPr>
+        <w:t xml:space="preserve"> form the access dimension, joined through the `User Team` junction (which also carries the organization), while `User Organization` and `Organization Team` associate users and teams to organizations. Access to the governed business systems is expressed through </w:t>
+      </w:r>
+      <w:r>
+        <w:rPr>
+          <w:rFonts w:ascii="Calibri" w:hAnsi="Calibri"/>
+          <w:b/>
+          <w:i w:val="0"/>
+          <w:color w:val="111827"/>
+          <w:sz w:val="22"/>
+        </w:rPr>
+        <w:t>Application</w:t>
+      </w:r>
+      <w:r>
+        <w:rPr>
+          <w:rFonts w:ascii="Calibri" w:hAnsi="Calibri"/>
+          <w:b w:val="0"/>
+          <w:i w:val="0"/>
+          <w:color w:val="111827"/>
+          <w:sz w:val="22"/>
+        </w:rPr>
+        <w:t xml:space="preserve"> and </w:t>
+      </w:r>
+      <w:r>
+        <w:rPr>
+          <w:rFonts w:ascii="Calibri" w:hAnsi="Calibri"/>
+          <w:b/>
+          <w:i w:val="0"/>
+          <w:color w:val="111827"/>
+          <w:sz w:val="22"/>
+        </w:rPr>
+        <w:t>Application Role</w:t>
+      </w:r>
+      <w:r>
+        <w:rPr>
+          <w:rFonts w:ascii="Calibri" w:hAnsi="Calibri"/>
+          <w:b w:val="0"/>
+          <w:i w:val="0"/>
+          <w:color w:val="111827"/>
+          <w:sz w:val="22"/>
+        </w:rPr>
+        <w:t xml:space="preserve">, each tied to a security </w:t>
+      </w:r>
+      <w:r>
+        <w:rPr>
+          <w:rFonts w:ascii="Calibri" w:hAnsi="Calibri"/>
+          <w:b/>
+          <w:i w:val="0"/>
+          <w:color w:val="111827"/>
+          <w:sz w:val="22"/>
+        </w:rPr>
+        <w:t>Group</w:t>
+      </w:r>
+      <w:r>
+        <w:rPr>
+          <w:rFonts w:ascii="Calibri" w:hAnsi="Calibri"/>
+          <w:b w:val="0"/>
+          <w:i w:val="0"/>
+          <w:color w:val="111827"/>
+          <w:sz w:val="22"/>
+        </w:rPr>
+        <w:t>.</w:t>
+      </w:r>
+    </w:p>
+    <w:p/>
+    <w:p>
+      <w:r>
+        <w:rPr>
+          <w:rFonts w:ascii="Calibri" w:hAnsi="Calibri"/>
+          <w:b w:val="0"/>
+          <w:i w:val="0"/>
+          <w:color w:val="111827"/>
+          <w:sz w:val="22"/>
+        </w:rPr>
+        <w:t xml:space="preserve">The third hub is the </w:t>
       </w:r>
       <w:r>
         <w:rPr>
@@ -294,7 +419,27 @@
           <w:color w:val="111827"/>
           <w:sz w:val="22"/>
         </w:rPr>
-        <w:t xml:space="preserve"> entity models the access request/approval lifecycle, with a rich audit sub-model hanging off it.</w:t>
+        <w:t xml:space="preserve"> audit chain — the heart of the request-and-approval workflow. A Task Request references its type (`Task Definiation`), its state (`Task Status`), the owning organization, and the requested team, and it owns a full audit trail: `Task Request Event History` (each business event on the request) which in turn owns `Task Request Reply Thread` (threaded comments) and links to `Task Request Event Type` and the acting user. `Task Request Subscriber` tracks who follows a request. A </w:t>
+      </w:r>
+      <w:r>
+        <w:rPr>
+          <w:rFonts w:ascii="Calibri" w:hAnsi="Calibri"/>
+          <w:b/>
+          <w:i w:val="0"/>
+          <w:color w:val="111827"/>
+          <w:sz w:val="22"/>
+        </w:rPr>
+        <w:t>parallel structure</w:t>
+      </w:r>
+      <w:r>
+        <w:rPr>
+          <w:rFonts w:ascii="Calibri" w:hAnsi="Calibri"/>
+          <w:b w:val="0"/>
+          <w:i w:val="0"/>
+          <w:color w:val="111827"/>
+          <w:sz w:val="22"/>
+        </w:rPr>
+        <w:t xml:space="preserve"> exists for team-level events (`Task Team Event History` / `Reply Thread` / `Subscriber` / `Event Type`).</w:t>
       </w:r>
     </w:p>
     <w:p/>
@@ -307,7 +452,7 @@
           <w:color w:val="111827"/>
           <w:sz w:val="22"/>
         </w:rPr>
-        <w:t xml:space="preserve">The design uses classic patterns throughout: </w:t>
+        <w:t xml:space="preserve">Two design patterns dominate. First, </w:t>
       </w:r>
       <w:r>
         <w:rPr>
@@ -317,7 +462,7 @@
           <w:color w:val="111827"/>
           <w:sz w:val="22"/>
         </w:rPr>
-        <w:t>lookup tables</w:t>
+        <w:t>lookup/reference tables</w:t>
       </w:r>
       <w:r>
         <w:rPr>
@@ -327,7 +472,7 @@
           <w:color w:val="111827"/>
           <w:sz w:val="22"/>
         </w:rPr>
-        <w:t xml:space="preserve"> for reference data (`Ref Country/State/City`, `Ref Role`, `Task Status`, `Task Definiation`) and enumerations; </w:t>
+        <w:t xml:space="preserve"> — `Ref Country`, `Ref State`, `Ref City`, `Ref Role`, `Task Status`, `Task Definiation`, and the two `Event Type` tables — constrain and label data rather than participate in the workflow. Second, </w:t>
       </w:r>
       <w:r>
         <w:rPr>
@@ -347,7 +492,7 @@
           <w:color w:val="111827"/>
           <w:sz w:val="22"/>
         </w:rPr>
-        <w:t xml:space="preserve"> for the many-to-many relationships between users, organizations, teams, applications, and roles; a </w:t>
+        <w:t xml:space="preserve"> (`User Organization`, `User Team`, `Organization Team`, `Organization Application`) resolve the many-to-many memberships. Every entity uses a surrogate integer `id` primary key, and person references (event user, reply user, subscriber, project manager, created/modified-by) point at the </w:t>
       </w:r>
       <w:r>
         <w:rPr>
@@ -357,7 +502,7 @@
           <w:color w:val="111827"/>
           <w:sz w:val="22"/>
         </w:rPr>
-        <w:t>self-referencing hierarchy</w:t>
+        <w:t>Appian system User record</w:t>
       </w:r>
       <w:r>
         <w:rPr>
@@ -367,42 +512,11 @@
           <w:color w:val="111827"/>
           <w:sz w:val="22"/>
         </w:rPr>
-        <w:t xml:space="preserve"> table where `Organization Hierarchy Data` points at Organization twice (parent and child) to model the org tree; and an </w:t>
-      </w:r>
-      <w:r>
-        <w:rPr>
-          <w:rFonts w:ascii="Calibri" w:hAnsi="Calibri"/>
-          <w:b/>
-          <w:i w:val="0"/>
-          <w:color w:val="111827"/>
-          <w:sz w:val="22"/>
-        </w:rPr>
-        <w:t>append-only audit sub-model</w:t>
-      </w:r>
-      <w:r>
-        <w:rPr>
-          <w:rFonts w:ascii="Calibri" w:hAnsi="Calibri"/>
-          <w:b w:val="0"/>
-          <w:i w:val="0"/>
-          <w:color w:val="111827"/>
-          <w:sz w:val="22"/>
-        </w:rPr>
-        <w:t xml:space="preserve"> where each `Task Request` (and its team-side counterpart) fans out to an event history, threaded replies, subscribers, and an event-type lookup.</w:t>
+        <w:t>, shown below as `APPIAN_USER`. All 31 entities are Appian synced records over the MariaDB `UAMS` database.</w:t>
       </w:r>
     </w:p>
     <w:p/>
-    <w:p>
-      <w:r>
-        <w:rPr>
-          <w:rFonts w:ascii="Calibri" w:hAnsi="Calibri"/>
-          <w:b w:val="0"/>
-          <w:i w:val="0"/>
-          <w:color w:val="111827"/>
-          <w:sz w:val="22"/>
-        </w:rPr>
-        <w:t>Notable characteristics: every entity carries a surrogate integer `id` primary key, camelCase fields, and standard audit columns (`createdBy/On`, `modifiedBy/On`, `isActive` soft-delete). Security groups (`UAM Group`) are first-class data — team roles and application roles both FK to a Group, tying the data model directly to the access-control model. All 31 tables replicate from the single `UAMS` schema; there are no cross-database relationships.</w:t>
-      </w:r>
-    </w:p>
+    <w:p/>
     <w:p/>
     <w:p>
       <w:pPr>
@@ -443,79 +557,6 @@
         </w:rPr>
         <w:t>erDiagram</w:t>
         <w:br/>
-        <w:t xml:space="preserve">  ORGANIZATION ||--o{ ORG_ADDRESS : "has"</w:t>
-        <w:br/>
-        <w:t xml:space="preserve">  ORGANIZATION ||--o{ ORG_CONTACT : "has"</w:t>
-        <w:br/>
-        <w:t xml:space="preserve">  ORGANIZATION ||--o{ ORG_HIERARCHY : "parent of"</w:t>
-        <w:br/>
-        <w:t xml:space="preserve">  ORGANIZATION ||--o{ USER_ORGANIZATION : "contains"</w:t>
-        <w:br/>
-        <w:t xml:space="preserve">  ORGANIZATION ||--o{ ORGANIZATION_TEAM : "maps"</w:t>
-        <w:br/>
-        <w:t xml:space="preserve">  ORGANIZATION ||--o{ ORGANIZATION_APPLICATION : "maps"</w:t>
-        <w:br/>
-        <w:t xml:space="preserve">  ORGANIZATION ||--o{ TASK_REQUEST : "scopes"</w:t>
-        <w:br/>
-        <w:br/>
-        <w:t xml:space="preserve">  ORG_ADDRESS }o--|| REF_CITY : "city"</w:t>
-        <w:br/>
-        <w:t xml:space="preserve">  ORG_ADDRESS }o--|| REF_STATE : "state"</w:t>
-        <w:br/>
-        <w:t xml:space="preserve">  ORG_ADDRESS }o--|| REF_COUNTRY : "country"</w:t>
-        <w:br/>
-        <w:t xml:space="preserve">  ORG_HIERARCHY }o--|| ORGANIZATION : "child"</w:t>
-        <w:br/>
-        <w:br/>
-        <w:t xml:space="preserve">  USER ||--o{ USER_ORGANIZATION : "member of"</w:t>
-        <w:br/>
-        <w:t xml:space="preserve">  USER ||--o{ USER_TEAM : "member of"</w:t>
-        <w:br/>
-        <w:t xml:space="preserve">  USER_ORGANIZATION }o--|| ORGANIZATION : "in"</w:t>
-        <w:br/>
-        <w:t xml:space="preserve">  USER_TEAM }o--|| TEAM : "in"</w:t>
-        <w:br/>
-        <w:t xml:space="preserve">  USER_TEAM }o--|| ORGANIZATION : "under"</w:t>
-        <w:br/>
-        <w:br/>
-        <w:t xml:space="preserve">  TEAM ||--o{ TEAM_ROLE : "has"</w:t>
-        <w:br/>
-        <w:t xml:space="preserve">  TEAM ||--o{ ORGANIZATION_TEAM : "mapped to"</w:t>
-        <w:br/>
-        <w:t xml:space="preserve">  TEAM_ROLE }o--|| GROUP : "backed by"</w:t>
-        <w:br/>
-        <w:t xml:space="preserve">  GROUP ||--o{ REF_ROLE : "role"</w:t>
-        <w:br/>
-        <w:br/>
-        <w:t xml:space="preserve">  APPLICATION ||--o{ APPLICATION_ROLE : "has"</w:t>
-        <w:br/>
-        <w:t xml:space="preserve">  APPLICATION ||--o{ ORGANIZATION_APPLICATION : "mapped to"</w:t>
-        <w:br/>
-        <w:t xml:space="preserve">  APPLICATION_ROLE }o--|| GROUP : "backed by"</w:t>
-        <w:br/>
-        <w:br/>
-        <w:t xml:space="preserve">  TASK_REQUEST }o--|| TASK_STATUS : "status"</w:t>
-        <w:br/>
-        <w:t xml:space="preserve">  TASK_REQUEST }o--|| TASK_DEFINITION : "type"</w:t>
-        <w:br/>
-        <w:t xml:space="preserve">  TASK_REQUEST }o--|| TEAM : "requested team"</w:t>
-        <w:br/>
-        <w:t xml:space="preserve">  TASK_REQUEST ||--o{ TASK_REQUEST_EVENT_HISTORY : "logs"</w:t>
-        <w:br/>
-        <w:t xml:space="preserve">  TASK_REQUEST ||--o{ TASK_REQUEST_SUBSCRIBER : "notifies"</w:t>
-        <w:br/>
-        <w:t xml:space="preserve">  TASK_REQUEST_EVENT_HISTORY }o--|| EVENT_TYPE : "of type"</w:t>
-        <w:br/>
-        <w:t xml:space="preserve">  TASK_REQUEST_EVENT_HISTORY ||--o{ TASK_REQUEST_REPLY_THREAD : "threads"</w:t>
-        <w:br/>
-        <w:br/>
-        <w:t xml:space="preserve">  TEAM ||--o{ TASK_TEAM_EVENT_HISTORY : "logs"</w:t>
-        <w:br/>
-        <w:t xml:space="preserve">  TASK_TEAM_EVENT_HISTORY ||--o{ TASK_TEAM_REPLY_THREAD : "threads"</w:t>
-        <w:br/>
-        <w:t xml:space="preserve">  TASK_TEAM_EVENT_HISTORY }o--|| TASK_TEAM_EVENT_TYPE : "of type"</w:t>
-        <w:br/>
-        <w:br/>
         <w:t xml:space="preserve">  ORGANIZATION {</w:t>
         <w:br/>
         <w:t xml:space="preserve">    integer id PK</w:t>
@@ -523,6 +564,132 @@
         <w:t xml:space="preserve">    text name</w:t>
         <w:br/>
         <w:t xml:space="preserve">    integer projectManagerUser FK</w:t>
+        <w:br/>
+        <w:t xml:space="preserve">  }</w:t>
+        <w:br/>
+        <w:t xml:space="preserve">  ORGANIZATION_ADDRESS {</w:t>
+        <w:br/>
+        <w:t xml:space="preserve">    integer id PK</w:t>
+        <w:br/>
+        <w:t xml:space="preserve">    integer organizationData FK</w:t>
+        <w:br/>
+        <w:t xml:space="preserve">    integer organizationCity FK</w:t>
+        <w:br/>
+        <w:t xml:space="preserve">    integer organizationState FK</w:t>
+        <w:br/>
+        <w:t xml:space="preserve">    integer organizationCountry FK</w:t>
+        <w:br/>
+        <w:t xml:space="preserve">  }</w:t>
+        <w:br/>
+        <w:t xml:space="preserve">  ORGANIZATION_CONTACT_DETAILS {</w:t>
+        <w:br/>
+        <w:t xml:space="preserve">    integer id PK</w:t>
+        <w:br/>
+        <w:t xml:space="preserve">    integer organizationData FK</w:t>
+        <w:br/>
+        <w:t xml:space="preserve">  }</w:t>
+        <w:br/>
+        <w:t xml:space="preserve">  ORGANIZATION_HIERARCHY_DATA {</w:t>
+        <w:br/>
+        <w:t xml:space="preserve">    integer id PK</w:t>
+        <w:br/>
+        <w:t xml:space="preserve">    integer parentorganizationData FK</w:t>
+        <w:br/>
+        <w:t xml:space="preserve">    integer childorganizationData FK</w:t>
+        <w:br/>
+        <w:t xml:space="preserve">  }</w:t>
+        <w:br/>
+        <w:t xml:space="preserve">  USER {</w:t>
+        <w:br/>
+        <w:t xml:space="preserve">    integer id PK</w:t>
+        <w:br/>
+        <w:t xml:space="preserve">    integer usernameUser FK</w:t>
+        <w:br/>
+        <w:t xml:space="preserve">  }</w:t>
+        <w:br/>
+        <w:t xml:space="preserve">  TEAM {</w:t>
+        <w:br/>
+        <w:t xml:space="preserve">    integer id PK</w:t>
+        <w:br/>
+        <w:t xml:space="preserve">    text name</w:t>
+        <w:br/>
+        <w:t xml:space="preserve">  }</w:t>
+        <w:br/>
+        <w:t xml:space="preserve">  TEAM_ROLE {</w:t>
+        <w:br/>
+        <w:t xml:space="preserve">    integer id PK</w:t>
+        <w:br/>
+        <w:t xml:space="preserve">    integer team FK</w:t>
+        <w:br/>
+        <w:t xml:space="preserve">    integer group FK</w:t>
+        <w:br/>
+        <w:t xml:space="preserve">  }</w:t>
+        <w:br/>
+        <w:t xml:space="preserve">  APPLICATION {</w:t>
+        <w:br/>
+        <w:t xml:space="preserve">    integer id PK</w:t>
+        <w:br/>
+        <w:t xml:space="preserve">    text name</w:t>
+        <w:br/>
+        <w:t xml:space="preserve">  }</w:t>
+        <w:br/>
+        <w:t xml:space="preserve">  APPLICATION_ROLE {</w:t>
+        <w:br/>
+        <w:t xml:space="preserve">    integer id PK</w:t>
+        <w:br/>
+        <w:t xml:space="preserve">    integer application FK</w:t>
+        <w:br/>
+        <w:t xml:space="preserve">    integer group FK</w:t>
+        <w:br/>
+        <w:t xml:space="preserve">  }</w:t>
+        <w:br/>
+        <w:t xml:space="preserve">  GROUP {</w:t>
+        <w:br/>
+        <w:t xml:space="preserve">    integer id PK</w:t>
+        <w:br/>
+        <w:t xml:space="preserve">    integer refRole FK</w:t>
+        <w:br/>
+        <w:t xml:space="preserve">  }</w:t>
+        <w:br/>
+        <w:t xml:space="preserve">  USER_ORGANIZATION {</w:t>
+        <w:br/>
+        <w:t xml:space="preserve">    integer id PK</w:t>
+        <w:br/>
+        <w:t xml:space="preserve">    integer user FK</w:t>
+        <w:br/>
+        <w:t xml:space="preserve">    integer organization FK</w:t>
+        <w:br/>
+        <w:t xml:space="preserve">  }</w:t>
+        <w:br/>
+        <w:t xml:space="preserve">  USER_TEAM {</w:t>
+        <w:br/>
+        <w:t xml:space="preserve">    integer id PK</w:t>
+        <w:br/>
+        <w:t xml:space="preserve">    integer user FK</w:t>
+        <w:br/>
+        <w:t xml:space="preserve">    integer team FK</w:t>
+        <w:br/>
+        <w:t xml:space="preserve">    integer organization FK</w:t>
+        <w:br/>
+        <w:t xml:space="preserve">  }</w:t>
+        <w:br/>
+        <w:t xml:space="preserve">  ORGANIZATION_TEAM {</w:t>
+        <w:br/>
+        <w:t xml:space="preserve">    integer id PK</w:t>
+        <w:br/>
+        <w:t xml:space="preserve">    integer organization FK</w:t>
+        <w:br/>
+        <w:t xml:space="preserve">    integer team FK</w:t>
+        <w:br/>
+        <w:t xml:space="preserve">  }</w:t>
+        <w:br/>
+        <w:t xml:space="preserve">  ORGANIZATION_APPLICATION {</w:t>
+        <w:br/>
+        <w:t xml:space="preserve">    integer id PK</w:t>
+        <w:br/>
+        <w:t xml:space="preserve">    integer organization FK</w:t>
+        <w:br/>
+        <w:t xml:space="preserve">    integer application FK</w:t>
         <w:br/>
         <w:t xml:space="preserve">  }</w:t>
         <w:br/>
@@ -540,53 +707,245 @@
         <w:br/>
         <w:t xml:space="preserve">    text reasonForRejection</w:t>
         <w:br/>
-        <w:t xml:space="preserve">    boolean isActive</w:t>
+        <w:t xml:space="preserve">  }</w:t>
+        <w:br/>
+        <w:t xml:space="preserve">  TASK_REQUEST_EVENT_HISTORY {</w:t>
+        <w:br/>
+        <w:t xml:space="preserve">    integer id PK</w:t>
+        <w:br/>
+        <w:t xml:space="preserve">    integer taskRequest FK</w:t>
+        <w:br/>
+        <w:t xml:space="preserve">    integer eventUser FK</w:t>
+        <w:br/>
+        <w:t xml:space="preserve">    integer eventType FK</w:t>
         <w:br/>
         <w:t xml:space="preserve">  }</w:t>
         <w:br/>
-        <w:t xml:space="preserve">  USER_TEAM {</w:t>
+        <w:t xml:space="preserve">  TASK_REQUEST_REPLY_THREAD {</w:t>
         <w:br/>
         <w:t xml:space="preserve">    integer id PK</w:t>
         <w:br/>
-        <w:t xml:space="preserve">    integer user FK</w:t>
+        <w:t xml:space="preserve">    integer eventHistory FK</w:t>
         <w:br/>
-        <w:t xml:space="preserve">    integer team FK</w:t>
-        <w:br/>
-        <w:t xml:space="preserve">    integer organization FK</w:t>
+        <w:t xml:space="preserve">    integer replyUser FK</w:t>
         <w:br/>
         <w:t xml:space="preserve">  }</w:t>
         <w:br/>
-        <w:t xml:space="preserve">  TEAM_ROLE {</w:t>
+        <w:t xml:space="preserve">  TASK_REQUEST_SUBSCRIBER {</w:t>
         <w:br/>
         <w:t xml:space="preserve">    integer id PK</w:t>
         <w:br/>
-        <w:t xml:space="preserve">    integer team FK</w:t>
+        <w:t xml:space="preserve">    integer taskRequest FK</w:t>
         <w:br/>
-        <w:t xml:space="preserve">    integer group FK</w:t>
+        <w:t xml:space="preserve">    integer subscriberUser FK</w:t>
         <w:br/>
         <w:t xml:space="preserve">  }</w:t>
         <w:br/>
-        <w:t xml:space="preserve">  APPLICATION_ROLE {</w:t>
+        <w:t xml:space="preserve">  TASK_REQUEST_EVENT_TYPE {</w:t>
         <w:br/>
         <w:t xml:space="preserve">    integer id PK</w:t>
         <w:br/>
-        <w:t xml:space="preserve">    integer application FK</w:t>
-        <w:br/>
-        <w:t xml:space="preserve">    integer group FK</w:t>
+        <w:t xml:space="preserve">    text name</w:t>
         <w:br/>
         <w:t xml:space="preserve">  }</w:t>
         <w:br/>
-        <w:t xml:space="preserve">  ORG_HIERARCHY {</w:t>
+        <w:t xml:space="preserve">  TASK_STATUS {</w:t>
         <w:br/>
         <w:t xml:space="preserve">    integer id PK</w:t>
         <w:br/>
-        <w:t xml:space="preserve">    integer parentorganizationData FK</w:t>
-        <w:br/>
-        <w:t xml:space="preserve">    integer childorganizationData FK</w:t>
+        <w:t xml:space="preserve">    text name</w:t>
         <w:br/>
         <w:t xml:space="preserve">  }</w:t>
+        <w:br/>
+        <w:t xml:space="preserve">  TASK_DEFINIATION {</w:t>
+        <w:br/>
+        <w:t xml:space="preserve">    integer id PK</w:t>
+        <w:br/>
+        <w:t xml:space="preserve">    text name</w:t>
+        <w:br/>
+        <w:t xml:space="preserve">  }</w:t>
+        <w:br/>
+        <w:t xml:space="preserve">  APPIAN_USER {</w:t>
+        <w:br/>
+        <w:t xml:space="preserve">    text username PK</w:t>
+        <w:br/>
+        <w:t xml:space="preserve">  }</w:t>
+        <w:br/>
+        <w:t xml:space="preserve">  REF_COUNTRY {</w:t>
+        <w:br/>
+        <w:t xml:space="preserve">    integer id PK</w:t>
+        <w:br/>
+        <w:t xml:space="preserve">    text name</w:t>
+        <w:br/>
+        <w:t xml:space="preserve">  }</w:t>
+        <w:br/>
+        <w:t xml:space="preserve">  REF_STATE {</w:t>
+        <w:br/>
+        <w:t xml:space="preserve">    integer id PK</w:t>
+        <w:br/>
+        <w:t xml:space="preserve">    text name</w:t>
+        <w:br/>
+        <w:t xml:space="preserve">  }</w:t>
+        <w:br/>
+        <w:t xml:space="preserve">  REF_CITY {</w:t>
+        <w:br/>
+        <w:t xml:space="preserve">    integer id PK</w:t>
+        <w:br/>
+        <w:t xml:space="preserve">    text name</w:t>
+        <w:br/>
+        <w:t xml:space="preserve">  }</w:t>
+        <w:br/>
+        <w:t xml:space="preserve">  REF_ROLE {</w:t>
+        <w:br/>
+        <w:t xml:space="preserve">    integer id PK</w:t>
+        <w:br/>
+        <w:t xml:space="preserve">    text name</w:t>
+        <w:br/>
+        <w:t xml:space="preserve">  }</w:t>
+        <w:br/>
+        <w:br/>
+        <w:t xml:space="preserve">  ORGANIZATION ||--o{ ORGANIZATION_ADDRESS : "has"</w:t>
+        <w:br/>
+        <w:t xml:space="preserve">  ORGANIZATION ||--o{ ORGANIZATION_CONTACT_DETAILS : "has"</w:t>
+        <w:br/>
+        <w:t xml:space="preserve">  ORGANIZATION ||--o{ ORGANIZATION_HIERARCHY_DATA : "parent of"</w:t>
+        <w:br/>
+        <w:t xml:space="preserve">  ORGANIZATION ||--o{ ORGANIZATION_HIERARCHY_DATA : "child of"</w:t>
+        <w:br/>
+        <w:t xml:space="preserve">  ORGANIZATION ||--o{ USER_ORGANIZATION : "includes"</w:t>
+        <w:br/>
+        <w:t xml:space="preserve">  ORGANIZATION ||--o{ ORGANIZATION_TEAM : "maps"</w:t>
+        <w:br/>
+        <w:t xml:space="preserve">  ORGANIZATION ||--o{ ORGANIZATION_APPLICATION : "governs"</w:t>
+        <w:br/>
+        <w:t xml:space="preserve">  ORGANIZATION }o--|| APPIAN_USER : "managed by"</w:t>
+        <w:br/>
+        <w:t xml:space="preserve">  ORGANIZATION_ADDRESS }o--|| REF_CITY : "in city"</w:t>
+        <w:br/>
+        <w:t xml:space="preserve">  ORGANIZATION_ADDRESS }o--|| REF_STATE : "in state"</w:t>
+        <w:br/>
+        <w:t xml:space="preserve">  ORGANIZATION_ADDRESS }o--|| REF_COUNTRY : "in country"</w:t>
+        <w:br/>
+        <w:t xml:space="preserve">  USER ||--o{ USER_ORGANIZATION : "belongs to"</w:t>
+        <w:br/>
+        <w:t xml:space="preserve">  USER ||--o{ USER_TEAM : "member of"</w:t>
+        <w:br/>
+        <w:t xml:space="preserve">  USER }o--|| APPIAN_USER : "is"</w:t>
+        <w:br/>
+        <w:t xml:space="preserve">  TEAM ||--o{ TEAM_ROLE : "has"</w:t>
+        <w:br/>
+        <w:t xml:space="preserve">  TEAM ||--o{ USER_TEAM : "includes"</w:t>
+        <w:br/>
+        <w:t xml:space="preserve">  TEAM ||--o{ ORGANIZATION_TEAM : "mapped to"</w:t>
+        <w:br/>
+        <w:t xml:space="preserve">  TEAM_ROLE }o--|| GROUP : "grants"</w:t>
+        <w:br/>
+        <w:t xml:space="preserve">  APPLICATION ||--o{ APPLICATION_ROLE : "defines"</w:t>
+        <w:br/>
+        <w:t xml:space="preserve">  APPLICATION ||--o{ ORGANIZATION_APPLICATION : "assigned via"</w:t>
+        <w:br/>
+        <w:t xml:space="preserve">  APPLICATION_ROLE }o--|| GROUP : "maps to"</w:t>
+        <w:br/>
+        <w:t xml:space="preserve">  GROUP }o--|| REF_ROLE : "typed as"</w:t>
+        <w:br/>
+        <w:t xml:space="preserve">  TASK_REQUEST }o--|| TASK_STATUS : "has status"</w:t>
+        <w:br/>
+        <w:t xml:space="preserve">  TASK_REQUEST }o--|| TASK_DEFINIATION : "of type"</w:t>
+        <w:br/>
+        <w:t xml:space="preserve">  TASK_REQUEST }o--|| ORGANIZATION : "for org"</w:t>
+        <w:br/>
+        <w:t xml:space="preserve">  TASK_REQUEST }o--|| TEAM : "requests team"</w:t>
+        <w:br/>
+        <w:t xml:space="preserve">  TASK_REQUEST ||--o{ TASK_REQUEST_EVENT_HISTORY : "logs"</w:t>
+        <w:br/>
+        <w:t xml:space="preserve">  TASK_REQUEST ||--o{ TASK_REQUEST_SUBSCRIBER : "watched by"</w:t>
+        <w:br/>
+        <w:t xml:space="preserve">  TASK_REQUEST_EVENT_HISTORY }o--|| TASK_REQUEST_EVENT_TYPE : "of type"</w:t>
+        <w:br/>
+        <w:t xml:space="preserve">  TASK_REQUEST_EVENT_HISTORY }o--|| APPIAN_USER : "by user"</w:t>
+        <w:br/>
+        <w:t xml:space="preserve">  TASK_REQUEST_EVENT_HISTORY ||--o{ TASK_REQUEST_REPLY_THREAD : "has replies"</w:t>
+        <w:br/>
+        <w:t xml:space="preserve">  TASK_REQUEST_REPLY_THREAD }o--|| APPIAN_USER : "replied by"</w:t>
+        <w:br/>
+        <w:t xml:space="preserve">  TASK_REQUEST_SUBSCRIBER }o--|| APPIAN_USER : "subscribes"</w:t>
       </w:r>
     </w:p>
+    <w:p/>
+    <w:p>
+      <w:r>
+        <w:rPr>
+          <w:rFonts w:ascii="Calibri" w:hAnsi="Calibri"/>
+          <w:b w:val="0"/>
+          <w:i w:val="0"/>
+          <w:color w:val="111827"/>
+          <w:sz w:val="22"/>
+        </w:rPr>
+        <w:t xml:space="preserve">&gt; </w:t>
+      </w:r>
+      <w:r>
+        <w:rPr>
+          <w:rFonts w:ascii="Calibri" w:hAnsi="Calibri"/>
+          <w:b/>
+          <w:i w:val="0"/>
+          <w:color w:val="111827"/>
+          <w:sz w:val="22"/>
+        </w:rPr>
+        <w:t>Note:</w:t>
+      </w:r>
+      <w:r>
+        <w:rPr>
+          <w:rFonts w:ascii="Calibri" w:hAnsi="Calibri"/>
+          <w:b w:val="0"/>
+          <w:i w:val="0"/>
+          <w:color w:val="111827"/>
+          <w:sz w:val="22"/>
+        </w:rPr>
+        <w:t xml:space="preserve"> For readability, this diagram shows the core entities, the four junction tables, the Task </w:t>
+      </w:r>
+      <w:r>
+        <w:rPr>
+          <w:rFonts w:ascii="Calibri" w:hAnsi="Calibri"/>
+          <w:b/>
+          <w:i w:val="0"/>
+          <w:color w:val="111827"/>
+          <w:sz w:val="22"/>
+        </w:rPr>
+        <w:t>Request</w:t>
+      </w:r>
+      <w:r>
+        <w:rPr>
+          <w:rFonts w:ascii="Calibri" w:hAnsi="Calibri"/>
+          <w:b w:val="0"/>
+          <w:i w:val="0"/>
+          <w:color w:val="111827"/>
+          <w:sz w:val="22"/>
+        </w:rPr>
+        <w:t xml:space="preserve"> audit chain, and the geographic/role reference tables. The </w:t>
+      </w:r>
+      <w:r>
+        <w:rPr>
+          <w:rFonts w:ascii="Calibri" w:hAnsi="Calibri"/>
+          <w:b/>
+          <w:i w:val="0"/>
+          <w:color w:val="111827"/>
+          <w:sz w:val="22"/>
+        </w:rPr>
+        <w:t>parallel Task Team</w:t>
+      </w:r>
+      <w:r>
+        <w:rPr>
+          <w:rFonts w:ascii="Calibri" w:hAnsi="Calibri"/>
+          <w:b w:val="0"/>
+          <w:i w:val="0"/>
+          <w:color w:val="111827"/>
+          <w:sz w:val="22"/>
+        </w:rPr>
+        <w:t xml:space="preserve"> audit chain (`Task Team Event History` / `Reply Thread` / `Subscriber` / `Event Type`) mirrors the Task Request chain against `Team` and is listed in the summary table below. `Feedback Category` and `Team Manage` are standalone/supporting tables. The `App prefix (UAM)` is stripped from entity names above.</w:t>
+      </w:r>
+    </w:p>
+    <w:p/>
+    <w:p/>
     <w:p/>
     <w:p>
       <w:pPr>
@@ -611,15 +970,14 @@
         <w:tblLook w:firstColumn="1" w:firstRow="1" w:lastColumn="0" w:lastRow="0" w:noHBand="0" w:noVBand="1" w:val="04A0"/>
       </w:tblPr>
       <w:tblGrid>
-        <w:gridCol w:w="2520"/>
-        <w:gridCol w:w="2520"/>
-        <w:gridCol w:w="2520"/>
-        <w:gridCol w:w="2520"/>
+        <w:gridCol w:w="3360"/>
+        <w:gridCol w:w="3360"/>
+        <w:gridCol w:w="3360"/>
       </w:tblGrid>
       <w:tr>
         <w:tc>
           <w:tcPr>
-            <w:tcW w:type="dxa" w:w="2520"/>
+            <w:tcW w:type="dxa" w:w="3360"/>
             <w:shd w:fill="1B7A47" w:val="clear"/>
           </w:tcPr>
           <w:p>
@@ -637,7 +995,7 @@
         </w:tc>
         <w:tc>
           <w:tcPr>
-            <w:tcW w:type="dxa" w:w="2520"/>
+            <w:tcW w:type="dxa" w:w="3360"/>
             <w:shd w:fill="1B7A47" w:val="clear"/>
           </w:tcPr>
           <w:p>
@@ -649,31 +1007,13 @@
                 <w:color w:val="FFFFFF"/>
                 <w:sz w:val="20"/>
               </w:rPr>
-              <w:t>Approx. relationships</w:t>
+              <w:t>Key Relationships</w:t>
             </w:r>
           </w:p>
         </w:tc>
         <w:tc>
           <w:tcPr>
-            <w:tcW w:type="dxa" w:w="2520"/>
-            <w:shd w:fill="1B7A47" w:val="clear"/>
-          </w:tcPr>
-          <w:p>
-            <w:r>
-              <w:rPr>
-                <w:rFonts w:ascii="Calibri" w:hAnsi="Calibri"/>
-                <w:b/>
-                <w:i w:val="0"/>
-                <w:color w:val="FFFFFF"/>
-                <w:sz w:val="20"/>
-              </w:rPr>
-              <w:t>Kind</w:t>
-            </w:r>
-          </w:p>
-        </w:tc>
-        <w:tc>
-          <w:tcPr>
-            <w:tcW w:type="dxa" w:w="2520"/>
+            <w:tcW w:type="dxa" w:w="3360"/>
             <w:shd w:fill="1B7A47" w:val="clear"/>
           </w:tcPr>
           <w:p>
@@ -693,7 +1033,7 @@
       <w:tr>
         <w:tc>
           <w:tcPr>
-            <w:tcW w:type="dxa" w:w="2520"/>
+            <w:tcW w:type="dxa" w:w="3360"/>
             <w:shd w:fill="FFFFFF" w:val="clear"/>
           </w:tcPr>
           <w:p>
@@ -711,7 +1051,7 @@
         </w:tc>
         <w:tc>
           <w:tcPr>
-            <w:tcW w:type="dxa" w:w="2520"/>
+            <w:tcW w:type="dxa" w:w="3360"/>
             <w:shd w:fill="FFFFFF" w:val="clear"/>
           </w:tcPr>
           <w:p>
@@ -723,13 +1063,13 @@
                 <w:color w:val="111827"/>
                 <w:sz w:val="20"/>
               </w:rPr>
-              <w:t>10 out/in</w:t>
+              <w:t>owns Address, Contact, Hierarchy, User/Team/Application maps; managed-by User</w:t>
             </w:r>
           </w:p>
         </w:tc>
         <w:tc>
           <w:tcPr>
-            <w:tcW w:type="dxa" w:w="2520"/>
+            <w:tcW w:type="dxa" w:w="3360"/>
             <w:shd w:fill="FFFFFF" w:val="clear"/>
           </w:tcPr>
           <w:p>
@@ -741,25 +1081,7 @@
                 <w:color w:val="111827"/>
                 <w:sz w:val="20"/>
               </w:rPr>
-              <w:t>Root</w:t>
-            </w:r>
-          </w:p>
-        </w:tc>
-        <w:tc>
-          <w:tcPr>
-            <w:tcW w:type="dxa" w:w="2520"/>
-            <w:shd w:fill="FFFFFF" w:val="clear"/>
-          </w:tcPr>
-          <w:p>
-            <w:r>
-              <w:rPr>
-                <w:rFonts w:ascii="Calibri" w:hAnsi="Calibri"/>
-                <w:b w:val="0"/>
-                <w:i w:val="0"/>
-                <w:color w:val="111827"/>
-                <w:sz w:val="20"/>
-              </w:rPr>
-              <w:t>Top-level container; owns addresses, contacts, hierarchy, and all mappings</w:t>
+              <w:t>Top-level container; self-referencing parent/child hierarchy</w:t>
             </w:r>
           </w:p>
         </w:tc>
@@ -767,7 +1089,7 @@
       <w:tr>
         <w:tc>
           <w:tcPr>
-            <w:tcW w:type="dxa" w:w="2520"/>
+            <w:tcW w:type="dxa" w:w="3360"/>
             <w:shd w:fill="F9FAFB" w:val="clear"/>
           </w:tcPr>
           <w:p>
@@ -785,7 +1107,7 @@
         </w:tc>
         <w:tc>
           <w:tcPr>
-            <w:tcW w:type="dxa" w:w="2520"/>
+            <w:tcW w:type="dxa" w:w="3360"/>
             <w:shd w:fill="F9FAFB" w:val="clear"/>
           </w:tcPr>
           <w:p>
@@ -797,31 +1119,13 @@
                 <w:color w:val="111827"/>
                 <w:sz w:val="20"/>
               </w:rPr>
-              <w:t>2</w:t>
+              <w:t>member of Teams (User Team); belongs to Organizations (User Organization)</w:t>
             </w:r>
           </w:p>
         </w:tc>
         <w:tc>
           <w:tcPr>
-            <w:tcW w:type="dxa" w:w="2520"/>
-            <w:shd w:fill="F9FAFB" w:val="clear"/>
-          </w:tcPr>
-          <w:p>
-            <w:r>
-              <w:rPr>
-                <w:rFonts w:ascii="Calibri" w:hAnsi="Calibri"/>
-                <w:b w:val="0"/>
-                <w:i w:val="0"/>
-                <w:color w:val="111827"/>
-                <w:sz w:val="20"/>
-              </w:rPr>
-              <w:t>Root</w:t>
-            </w:r>
-          </w:p>
-        </w:tc>
-        <w:tc>
-          <w:tcPr>
-            <w:tcW w:type="dxa" w:w="2520"/>
+            <w:tcW w:type="dxa" w:w="3360"/>
             <w:shd w:fill="F9FAFB" w:val="clear"/>
           </w:tcPr>
           <w:p>
@@ -841,7 +1145,7 @@
       <w:tr>
         <w:tc>
           <w:tcPr>
-            <w:tcW w:type="dxa" w:w="2520"/>
+            <w:tcW w:type="dxa" w:w="3360"/>
             <w:shd w:fill="FFFFFF" w:val="clear"/>
           </w:tcPr>
           <w:p>
@@ -859,7 +1163,7 @@
         </w:tc>
         <w:tc>
           <w:tcPr>
-            <w:tcW w:type="dxa" w:w="2520"/>
+            <w:tcW w:type="dxa" w:w="3360"/>
             <w:shd w:fill="FFFFFF" w:val="clear"/>
           </w:tcPr>
           <w:p>
@@ -871,31 +1175,13 @@
                 <w:color w:val="111827"/>
                 <w:sz w:val="20"/>
               </w:rPr>
-              <w:t>4</w:t>
+              <w:t>has Team Roles; mapped to Organizations &amp; Applications</w:t>
             </w:r>
           </w:p>
         </w:tc>
         <w:tc>
           <w:tcPr>
-            <w:tcW w:type="dxa" w:w="2520"/>
-            <w:shd w:fill="FFFFFF" w:val="clear"/>
-          </w:tcPr>
-          <w:p>
-            <w:r>
-              <w:rPr>
-                <w:rFonts w:ascii="Calibri" w:hAnsi="Calibri"/>
-                <w:b w:val="0"/>
-                <w:i w:val="0"/>
-                <w:color w:val="111827"/>
-                <w:sz w:val="20"/>
-              </w:rPr>
-              <w:t>Root</w:t>
-            </w:r>
-          </w:p>
-        </w:tc>
-        <w:tc>
-          <w:tcPr>
-            <w:tcW w:type="dxa" w:w="2520"/>
+            <w:tcW w:type="dxa" w:w="3360"/>
             <w:shd w:fill="FFFFFF" w:val="clear"/>
           </w:tcPr>
           <w:p>
@@ -915,7 +1201,7 @@
       <w:tr>
         <w:tc>
           <w:tcPr>
-            <w:tcW w:type="dxa" w:w="2520"/>
+            <w:tcW w:type="dxa" w:w="3360"/>
             <w:shd w:fill="F9FAFB" w:val="clear"/>
           </w:tcPr>
           <w:p>
@@ -933,7 +1219,7 @@
         </w:tc>
         <w:tc>
           <w:tcPr>
-            <w:tcW w:type="dxa" w:w="2520"/>
+            <w:tcW w:type="dxa" w:w="3360"/>
             <w:shd w:fill="F9FAFB" w:val="clear"/>
           </w:tcPr>
           <w:p>
@@ -945,13 +1231,13 @@
                 <w:color w:val="111827"/>
                 <w:sz w:val="20"/>
               </w:rPr>
-              <w:t>2</w:t>
+              <w:t>defines Application Roles; assigned to Organizations</w:t>
             </w:r>
           </w:p>
         </w:tc>
         <w:tc>
           <w:tcPr>
-            <w:tcW w:type="dxa" w:w="2520"/>
+            <w:tcW w:type="dxa" w:w="3360"/>
             <w:shd w:fill="F9FAFB" w:val="clear"/>
           </w:tcPr>
           <w:p>
@@ -963,14 +1249,16 @@
                 <w:color w:val="111827"/>
                 <w:sz w:val="20"/>
               </w:rPr>
-              <w:t>Root</w:t>
+              <w:t>A governed business system</w:t>
             </w:r>
           </w:p>
         </w:tc>
+      </w:tr>
+      <w:tr>
         <w:tc>
           <w:tcPr>
-            <w:tcW w:type="dxa" w:w="2520"/>
-            <w:shd w:fill="F9FAFB" w:val="clear"/>
+            <w:tcW w:type="dxa" w:w="3360"/>
+            <w:shd w:fill="FFFFFF" w:val="clear"/>
           </w:tcPr>
           <w:p>
             <w:r>
@@ -981,7 +1269,43 @@
                 <w:color w:val="111827"/>
                 <w:sz w:val="20"/>
               </w:rPr>
-              <w:t>A governed business application</w:t>
+              <w:t>Task Request</w:t>
+            </w:r>
+          </w:p>
+        </w:tc>
+        <w:tc>
+          <w:tcPr>
+            <w:tcW w:type="dxa" w:w="3360"/>
+            <w:shd w:fill="FFFFFF" w:val="clear"/>
+          </w:tcPr>
+          <w:p>
+            <w:r>
+              <w:rPr>
+                <w:rFonts w:ascii="Calibri" w:hAnsi="Calibri"/>
+                <w:b w:val="0"/>
+                <w:i w:val="0"/>
+                <w:color w:val="111827"/>
+                <w:sz w:val="20"/>
+              </w:rPr>
+              <w:t>→ Task Status, Task Definiation, Organization, Team; owns Event History + Subscribers</w:t>
+            </w:r>
+          </w:p>
+        </w:tc>
+        <w:tc>
+          <w:tcPr>
+            <w:tcW w:type="dxa" w:w="3360"/>
+            <w:shd w:fill="FFFFFF" w:val="clear"/>
+          </w:tcPr>
+          <w:p>
+            <w:r>
+              <w:rPr>
+                <w:rFonts w:ascii="Calibri" w:hAnsi="Calibri"/>
+                <w:b w:val="0"/>
+                <w:i w:val="0"/>
+                <w:color w:val="111827"/>
+                <w:sz w:val="20"/>
+              </w:rPr>
+              <w:t>An access grant/revoke request record</w:t>
             </w:r>
           </w:p>
         </w:tc>
@@ -989,8 +1313,8 @@
       <w:tr>
         <w:tc>
           <w:tcPr>
-            <w:tcW w:type="dxa" w:w="2520"/>
-            <w:shd w:fill="FFFFFF" w:val="clear"/>
+            <w:tcW w:type="dxa" w:w="3360"/>
+            <w:shd w:fill="F9FAFB" w:val="clear"/>
           </w:tcPr>
           <w:p>
             <w:r>
@@ -1007,7 +1331,45 @@
         </w:tc>
         <w:tc>
           <w:tcPr>
-            <w:tcW w:type="dxa" w:w="2520"/>
+            <w:tcW w:type="dxa" w:w="3360"/>
+            <w:shd w:fill="F9FAFB" w:val="clear"/>
+          </w:tcPr>
+          <w:p>
+            <w:r>
+              <w:rPr>
+                <w:rFonts w:ascii="Calibri" w:hAnsi="Calibri"/>
+                <w:b w:val="0"/>
+                <w:i w:val="0"/>
+                <w:color w:val="111827"/>
+                <w:sz w:val="20"/>
+              </w:rPr>
+              <w:t>typed by Ref Role</w:t>
+            </w:r>
+          </w:p>
+        </w:tc>
+        <w:tc>
+          <w:tcPr>
+            <w:tcW w:type="dxa" w:w="3360"/>
+            <w:shd w:fill="F9FAFB" w:val="clear"/>
+          </w:tcPr>
+          <w:p>
+            <w:r>
+              <w:rPr>
+                <w:rFonts w:ascii="Calibri" w:hAnsi="Calibri"/>
+                <w:b w:val="0"/>
+                <w:i w:val="0"/>
+                <w:color w:val="111827"/>
+                <w:sz w:val="20"/>
+              </w:rPr>
+              <w:t>Security group backing team &amp; application roles</w:t>
+            </w:r>
+          </w:p>
+        </w:tc>
+      </w:tr>
+      <w:tr>
+        <w:tc>
+          <w:tcPr>
+            <w:tcW w:type="dxa" w:w="3360"/>
             <w:shd w:fill="FFFFFF" w:val="clear"/>
           </w:tcPr>
           <w:p>
@@ -1019,13 +1381,13 @@
                 <w:color w:val="111827"/>
                 <w:sz w:val="20"/>
               </w:rPr>
-              <w:t>2 (in)</w:t>
+              <w:t>Application Role</w:t>
             </w:r>
           </w:p>
         </w:tc>
         <w:tc>
           <w:tcPr>
-            <w:tcW w:type="dxa" w:w="2520"/>
+            <w:tcW w:type="dxa" w:w="3360"/>
             <w:shd w:fill="FFFFFF" w:val="clear"/>
           </w:tcPr>
           <w:p>
@@ -1037,13 +1399,13 @@
                 <w:color w:val="111827"/>
                 <w:sz w:val="20"/>
               </w:rPr>
-              <w:t>Root</w:t>
+              <w:t>→ Application, Group</w:t>
             </w:r>
           </w:p>
         </w:tc>
         <w:tc>
           <w:tcPr>
-            <w:tcW w:type="dxa" w:w="2520"/>
+            <w:tcW w:type="dxa" w:w="3360"/>
             <w:shd w:fill="FFFFFF" w:val="clear"/>
           </w:tcPr>
           <w:p>
@@ -1055,7 +1417,7 @@
                 <w:color w:val="111827"/>
                 <w:sz w:val="20"/>
               </w:rPr>
-              <w:t>Appian security group backing team &amp; application roles</w:t>
+              <w:t>Role/group mapping for an application</w:t>
             </w:r>
           </w:p>
         </w:tc>
@@ -1063,7 +1425,7 @@
       <w:tr>
         <w:tc>
           <w:tcPr>
-            <w:tcW w:type="dxa" w:w="2520"/>
+            <w:tcW w:type="dxa" w:w="3360"/>
             <w:shd w:fill="F9FAFB" w:val="clear"/>
           </w:tcPr>
           <w:p>
@@ -1075,13 +1437,13 @@
                 <w:color w:val="111827"/>
                 <w:sz w:val="20"/>
               </w:rPr>
-              <w:t>Task Request</w:t>
+              <w:t>Team Role</w:t>
             </w:r>
           </w:p>
         </w:tc>
         <w:tc>
           <w:tcPr>
-            <w:tcW w:type="dxa" w:w="2520"/>
+            <w:tcW w:type="dxa" w:w="3360"/>
             <w:shd w:fill="F9FAFB" w:val="clear"/>
           </w:tcPr>
           <w:p>
@@ -1093,13 +1455,13 @@
                 <w:color w:val="111827"/>
                 <w:sz w:val="20"/>
               </w:rPr>
-              <w:t>6</w:t>
+              <w:t>→ Team, Group</w:t>
             </w:r>
           </w:p>
         </w:tc>
         <w:tc>
           <w:tcPr>
-            <w:tcW w:type="dxa" w:w="2520"/>
+            <w:tcW w:type="dxa" w:w="3360"/>
             <w:shd w:fill="F9FAFB" w:val="clear"/>
           </w:tcPr>
           <w:p>
@@ -1111,25 +1473,7 @@
                 <w:color w:val="111827"/>
                 <w:sz w:val="20"/>
               </w:rPr>
-              <w:t>Core</w:t>
-            </w:r>
-          </w:p>
-        </w:tc>
-        <w:tc>
-          <w:tcPr>
-            <w:tcW w:type="dxa" w:w="2520"/>
-            <w:shd w:fill="F9FAFB" w:val="clear"/>
-          </w:tcPr>
-          <w:p>
-            <w:r>
-              <w:rPr>
-                <w:rFonts w:ascii="Calibri" w:hAnsi="Calibri"/>
-                <w:b w:val="0"/>
-                <w:i w:val="0"/>
-                <w:color w:val="111827"/>
-                <w:sz w:val="20"/>
-              </w:rPr>
-              <w:t>Access request (grant/revoke) with status, type, org, team</w:t>
+              <w:t>Role a team carries, tied to a group</w:t>
             </w:r>
           </w:p>
         </w:tc>
@@ -1137,7 +1481,7 @@
       <w:tr>
         <w:tc>
           <w:tcPr>
-            <w:tcW w:type="dxa" w:w="2520"/>
+            <w:tcW w:type="dxa" w:w="3360"/>
             <w:shd w:fill="FFFFFF" w:val="clear"/>
           </w:tcPr>
           <w:p>
@@ -1155,7 +1499,7 @@
         </w:tc>
         <w:tc>
           <w:tcPr>
-            <w:tcW w:type="dxa" w:w="2520"/>
+            <w:tcW w:type="dxa" w:w="3360"/>
             <w:shd w:fill="FFFFFF" w:val="clear"/>
           </w:tcPr>
           <w:p>
@@ -1167,13 +1511,13 @@
                 <w:color w:val="111827"/>
                 <w:sz w:val="20"/>
               </w:rPr>
-              <w:t>4</w:t>
+              <w:t>→ Organization, Ref City/State/Country</w:t>
             </w:r>
           </w:p>
         </w:tc>
         <w:tc>
           <w:tcPr>
-            <w:tcW w:type="dxa" w:w="2520"/>
+            <w:tcW w:type="dxa" w:w="3360"/>
             <w:shd w:fill="FFFFFF" w:val="clear"/>
           </w:tcPr>
           <w:p>
@@ -1185,25 +1529,7 @@
                 <w:color w:val="111827"/>
                 <w:sz w:val="20"/>
               </w:rPr>
-              <w:t>Child</w:t>
-            </w:r>
-          </w:p>
-        </w:tc>
-        <w:tc>
-          <w:tcPr>
-            <w:tcW w:type="dxa" w:w="2520"/>
-            <w:shd w:fill="FFFFFF" w:val="clear"/>
-          </w:tcPr>
-          <w:p>
-            <w:r>
-              <w:rPr>
-                <w:rFonts w:ascii="Calibri" w:hAnsi="Calibri"/>
-                <w:b w:val="0"/>
-                <w:i w:val="0"/>
-                <w:color w:val="111827"/>
-                <w:sz w:val="20"/>
-              </w:rPr>
-              <w:t>Org postal address (city/state/country FKs)</w:t>
+              <w:t>Postal address of an organization</w:t>
             </w:r>
           </w:p>
         </w:tc>
@@ -1211,7 +1537,7 @@
       <w:tr>
         <w:tc>
           <w:tcPr>
-            <w:tcW w:type="dxa" w:w="2520"/>
+            <w:tcW w:type="dxa" w:w="3360"/>
             <w:shd w:fill="F9FAFB" w:val="clear"/>
           </w:tcPr>
           <w:p>
@@ -1229,7 +1555,7 @@
         </w:tc>
         <w:tc>
           <w:tcPr>
-            <w:tcW w:type="dxa" w:w="2520"/>
+            <w:tcW w:type="dxa" w:w="3360"/>
             <w:shd w:fill="F9FAFB" w:val="clear"/>
           </w:tcPr>
           <w:p>
@@ -1241,13 +1567,13 @@
                 <w:color w:val="111827"/>
                 <w:sz w:val="20"/>
               </w:rPr>
-              <w:t>1</w:t>
+              <w:t>→ Organization</w:t>
             </w:r>
           </w:p>
         </w:tc>
         <w:tc>
           <w:tcPr>
-            <w:tcW w:type="dxa" w:w="2520"/>
+            <w:tcW w:type="dxa" w:w="3360"/>
             <w:shd w:fill="F9FAFB" w:val="clear"/>
           </w:tcPr>
           <w:p>
@@ -1259,25 +1585,7 @@
                 <w:color w:val="111827"/>
                 <w:sz w:val="20"/>
               </w:rPr>
-              <w:t>Child</w:t>
-            </w:r>
-          </w:p>
-        </w:tc>
-        <w:tc>
-          <w:tcPr>
-            <w:tcW w:type="dxa" w:w="2520"/>
-            <w:shd w:fill="F9FAFB" w:val="clear"/>
-          </w:tcPr>
-          <w:p>
-            <w:r>
-              <w:rPr>
-                <w:rFonts w:ascii="Calibri" w:hAnsi="Calibri"/>
-                <w:b w:val="0"/>
-                <w:i w:val="0"/>
-                <w:color w:val="111827"/>
-                <w:sz w:val="20"/>
-              </w:rPr>
-              <w:t>Org contacts</w:t>
+              <w:t>Contact info for an organization</w:t>
             </w:r>
           </w:p>
         </w:tc>
@@ -1285,7 +1593,7 @@
       <w:tr>
         <w:tc>
           <w:tcPr>
-            <w:tcW w:type="dxa" w:w="2520"/>
+            <w:tcW w:type="dxa" w:w="3360"/>
             <w:shd w:fill="FFFFFF" w:val="clear"/>
           </w:tcPr>
           <w:p>
@@ -1303,7 +1611,7 @@
         </w:tc>
         <w:tc>
           <w:tcPr>
-            <w:tcW w:type="dxa" w:w="2520"/>
+            <w:tcW w:type="dxa" w:w="3360"/>
             <w:shd w:fill="FFFFFF" w:val="clear"/>
           </w:tcPr>
           <w:p>
@@ -1315,13 +1623,13 @@
                 <w:color w:val="111827"/>
                 <w:sz w:val="20"/>
               </w:rPr>
-              <w:t>2 (self-ref)</w:t>
+              <w:t>→ Organization (parent), Organization (child)</w:t>
             </w:r>
           </w:p>
         </w:tc>
         <w:tc>
           <w:tcPr>
-            <w:tcW w:type="dxa" w:w="2520"/>
+            <w:tcW w:type="dxa" w:w="3360"/>
             <w:shd w:fill="FFFFFF" w:val="clear"/>
           </w:tcPr>
           <w:p>
@@ -1333,13 +1641,71 @@
                 <w:color w:val="111827"/>
                 <w:sz w:val="20"/>
               </w:rPr>
-              <w:t>Child</w:t>
+              <w:t>Self-referencing org tree link</w:t>
+            </w:r>
+          </w:p>
+        </w:tc>
+      </w:tr>
+      <w:tr>
+        <w:tc>
+          <w:tcPr>
+            <w:tcW w:type="dxa" w:w="3360"/>
+            <w:shd w:fill="F9FAFB" w:val="clear"/>
+          </w:tcPr>
+          <w:p>
+            <w:r>
+              <w:rPr>
+                <w:rFonts w:ascii="Calibri" w:hAnsi="Calibri"/>
+                <w:b w:val="0"/>
+                <w:i w:val="0"/>
+                <w:color w:val="111827"/>
+                <w:sz w:val="20"/>
+              </w:rPr>
+              <w:t>User Organization *(junction)*</w:t>
             </w:r>
           </w:p>
         </w:tc>
         <w:tc>
           <w:tcPr>
-            <w:tcW w:type="dxa" w:w="2520"/>
+            <w:tcW w:type="dxa" w:w="3360"/>
+            <w:shd w:fill="F9FAFB" w:val="clear"/>
+          </w:tcPr>
+          <w:p>
+            <w:r>
+              <w:rPr>
+                <w:rFonts w:ascii="Calibri" w:hAnsi="Calibri"/>
+                <w:b w:val="0"/>
+                <w:i w:val="0"/>
+                <w:color w:val="111827"/>
+                <w:sz w:val="20"/>
+              </w:rPr>
+              <w:t>→ User, Organization</w:t>
+            </w:r>
+          </w:p>
+        </w:tc>
+        <w:tc>
+          <w:tcPr>
+            <w:tcW w:type="dxa" w:w="3360"/>
+            <w:shd w:fill="F9FAFB" w:val="clear"/>
+          </w:tcPr>
+          <w:p>
+            <w:r>
+              <w:rPr>
+                <w:rFonts w:ascii="Calibri" w:hAnsi="Calibri"/>
+                <w:b w:val="0"/>
+                <w:i w:val="0"/>
+                <w:color w:val="111827"/>
+                <w:sz w:val="20"/>
+              </w:rPr>
+              <w:t>User ↔ Organization membership</w:t>
+            </w:r>
+          </w:p>
+        </w:tc>
+      </w:tr>
+      <w:tr>
+        <w:tc>
+          <w:tcPr>
+            <w:tcW w:type="dxa" w:w="3360"/>
             <w:shd w:fill="FFFFFF" w:val="clear"/>
           </w:tcPr>
           <w:p>
@@ -1351,7 +1717,43 @@
                 <w:color w:val="111827"/>
                 <w:sz w:val="20"/>
               </w:rPr>
-              <w:t>Parent↔child org relationships</w:t>
+              <w:t>User Team *(junction)*</w:t>
+            </w:r>
+          </w:p>
+        </w:tc>
+        <w:tc>
+          <w:tcPr>
+            <w:tcW w:type="dxa" w:w="3360"/>
+            <w:shd w:fill="FFFFFF" w:val="clear"/>
+          </w:tcPr>
+          <w:p>
+            <w:r>
+              <w:rPr>
+                <w:rFonts w:ascii="Calibri" w:hAnsi="Calibri"/>
+                <w:b w:val="0"/>
+                <w:i w:val="0"/>
+                <w:color w:val="111827"/>
+                <w:sz w:val="20"/>
+              </w:rPr>
+              <w:t>→ User, Team, Organization</w:t>
+            </w:r>
+          </w:p>
+        </w:tc>
+        <w:tc>
+          <w:tcPr>
+            <w:tcW w:type="dxa" w:w="3360"/>
+            <w:shd w:fill="FFFFFF" w:val="clear"/>
+          </w:tcPr>
+          <w:p>
+            <w:r>
+              <w:rPr>
+                <w:rFonts w:ascii="Calibri" w:hAnsi="Calibri"/>
+                <w:b w:val="0"/>
+                <w:i w:val="0"/>
+                <w:color w:val="111827"/>
+                <w:sz w:val="20"/>
+              </w:rPr>
+              <w:t>User ↔ Team membership (with org)</w:t>
             </w:r>
           </w:p>
         </w:tc>
@@ -1359,7 +1761,7 @@
       <w:tr>
         <w:tc>
           <w:tcPr>
-            <w:tcW w:type="dxa" w:w="2520"/>
+            <w:tcW w:type="dxa" w:w="3360"/>
             <w:shd w:fill="F9FAFB" w:val="clear"/>
           </w:tcPr>
           <w:p>
@@ -1371,13 +1773,13 @@
                 <w:color w:val="111827"/>
                 <w:sz w:val="20"/>
               </w:rPr>
-              <w:t>Team Role</w:t>
+              <w:t>Organization Team *(junction)*</w:t>
             </w:r>
           </w:p>
         </w:tc>
         <w:tc>
           <w:tcPr>
-            <w:tcW w:type="dxa" w:w="2520"/>
+            <w:tcW w:type="dxa" w:w="3360"/>
             <w:shd w:fill="F9FAFB" w:val="clear"/>
           </w:tcPr>
           <w:p>
@@ -1389,13 +1791,13 @@
                 <w:color w:val="111827"/>
                 <w:sz w:val="20"/>
               </w:rPr>
-              <w:t>2</w:t>
+              <w:t>→ Organization, Team</w:t>
             </w:r>
           </w:p>
         </w:tc>
         <w:tc>
           <w:tcPr>
-            <w:tcW w:type="dxa" w:w="2520"/>
+            <w:tcW w:type="dxa" w:w="3360"/>
             <w:shd w:fill="F9FAFB" w:val="clear"/>
           </w:tcPr>
           <w:p>
@@ -1407,25 +1809,7 @@
                 <w:color w:val="111827"/>
                 <w:sz w:val="20"/>
               </w:rPr>
-              <w:t>Child</w:t>
-            </w:r>
-          </w:p>
-        </w:tc>
-        <w:tc>
-          <w:tcPr>
-            <w:tcW w:type="dxa" w:w="2520"/>
-            <w:shd w:fill="F9FAFB" w:val="clear"/>
-          </w:tcPr>
-          <w:p>
-            <w:r>
-              <w:rPr>
-                <w:rFonts w:ascii="Calibri" w:hAnsi="Calibri"/>
-                <w:b w:val="0"/>
-                <w:i w:val="0"/>
-                <w:color w:val="111827"/>
-                <w:sz w:val="20"/>
-              </w:rPr>
-              <w:t>A team's role, backed by a Group</w:t>
+              <w:t>Organization ↔ Team mapping</w:t>
             </w:r>
           </w:p>
         </w:tc>
@@ -1433,7 +1817,7 @@
       <w:tr>
         <w:tc>
           <w:tcPr>
-            <w:tcW w:type="dxa" w:w="2520"/>
+            <w:tcW w:type="dxa" w:w="3360"/>
             <w:shd w:fill="FFFFFF" w:val="clear"/>
           </w:tcPr>
           <w:p>
@@ -1445,13 +1829,13 @@
                 <w:color w:val="111827"/>
                 <w:sz w:val="20"/>
               </w:rPr>
-              <w:t>Application Role</w:t>
+              <w:t>Organization Application *(junction)*</w:t>
             </w:r>
           </w:p>
         </w:tc>
         <w:tc>
           <w:tcPr>
-            <w:tcW w:type="dxa" w:w="2520"/>
+            <w:tcW w:type="dxa" w:w="3360"/>
             <w:shd w:fill="FFFFFF" w:val="clear"/>
           </w:tcPr>
           <w:p>
@@ -1463,13 +1847,13 @@
                 <w:color w:val="111827"/>
                 <w:sz w:val="20"/>
               </w:rPr>
-              <w:t>2</w:t>
+              <w:t>→ Organization, Application</w:t>
             </w:r>
           </w:p>
         </w:tc>
         <w:tc>
           <w:tcPr>
-            <w:tcW w:type="dxa" w:w="2520"/>
+            <w:tcW w:type="dxa" w:w="3360"/>
             <w:shd w:fill="FFFFFF" w:val="clear"/>
           </w:tcPr>
           <w:p>
@@ -1481,25 +1865,7 @@
                 <w:color w:val="111827"/>
                 <w:sz w:val="20"/>
               </w:rPr>
-              <w:t>Child</w:t>
-            </w:r>
-          </w:p>
-        </w:tc>
-        <w:tc>
-          <w:tcPr>
-            <w:tcW w:type="dxa" w:w="2520"/>
-            <w:shd w:fill="FFFFFF" w:val="clear"/>
-          </w:tcPr>
-          <w:p>
-            <w:r>
-              <w:rPr>
-                <w:rFonts w:ascii="Calibri" w:hAnsi="Calibri"/>
-                <w:b w:val="0"/>
-                <w:i w:val="0"/>
-                <w:color w:val="111827"/>
-                <w:sz w:val="20"/>
-              </w:rPr>
-              <w:t>An application's role, backed by a Group</w:t>
+              <w:t>Organization ↔ Application mapping</w:t>
             </w:r>
           </w:p>
         </w:tc>
@@ -1507,303 +1873,7 @@
       <w:tr>
         <w:tc>
           <w:tcPr>
-            <w:tcW w:type="dxa" w:w="2520"/>
-            <w:shd w:fill="F9FAFB" w:val="clear"/>
-          </w:tcPr>
-          <w:p>
-            <w:r>
-              <w:rPr>
-                <w:rFonts w:ascii="Calibri" w:hAnsi="Calibri"/>
-                <w:b w:val="0"/>
-                <w:i w:val="0"/>
-                <w:color w:val="111827"/>
-                <w:sz w:val="20"/>
-              </w:rPr>
-              <w:t>User Organization</w:t>
-            </w:r>
-          </w:p>
-        </w:tc>
-        <w:tc>
-          <w:tcPr>
-            <w:tcW w:type="dxa" w:w="2520"/>
-            <w:shd w:fill="F9FAFB" w:val="clear"/>
-          </w:tcPr>
-          <w:p>
-            <w:r>
-              <w:rPr>
-                <w:rFonts w:ascii="Calibri" w:hAnsi="Calibri"/>
-                <w:b w:val="0"/>
-                <w:i w:val="0"/>
-                <w:color w:val="111827"/>
-                <w:sz w:val="20"/>
-              </w:rPr>
-              <w:t>2</w:t>
-            </w:r>
-          </w:p>
-        </w:tc>
-        <w:tc>
-          <w:tcPr>
-            <w:tcW w:type="dxa" w:w="2520"/>
-            <w:shd w:fill="F9FAFB" w:val="clear"/>
-          </w:tcPr>
-          <w:p>
-            <w:r>
-              <w:rPr>
-                <w:rFonts w:ascii="Calibri" w:hAnsi="Calibri"/>
-                <w:b w:val="0"/>
-                <w:i w:val="0"/>
-                <w:color w:val="111827"/>
-                <w:sz w:val="20"/>
-              </w:rPr>
-              <w:t>Junction</w:t>
-            </w:r>
-          </w:p>
-        </w:tc>
-        <w:tc>
-          <w:tcPr>
-            <w:tcW w:type="dxa" w:w="2520"/>
-            <w:shd w:fill="F9FAFB" w:val="clear"/>
-          </w:tcPr>
-          <w:p>
-            <w:r>
-              <w:rPr>
-                <w:rFonts w:ascii="Calibri" w:hAnsi="Calibri"/>
-                <w:b w:val="0"/>
-                <w:i w:val="0"/>
-                <w:color w:val="111827"/>
-                <w:sz w:val="20"/>
-              </w:rPr>
-              <w:t>User ↔ Organization</w:t>
-            </w:r>
-          </w:p>
-        </w:tc>
-      </w:tr>
-      <w:tr>
-        <w:tc>
-          <w:tcPr>
-            <w:tcW w:type="dxa" w:w="2520"/>
-            <w:shd w:fill="FFFFFF" w:val="clear"/>
-          </w:tcPr>
-          <w:p>
-            <w:r>
-              <w:rPr>
-                <w:rFonts w:ascii="Calibri" w:hAnsi="Calibri"/>
-                <w:b w:val="0"/>
-                <w:i w:val="0"/>
-                <w:color w:val="111827"/>
-                <w:sz w:val="20"/>
-              </w:rPr>
-              <w:t>User Team</w:t>
-            </w:r>
-          </w:p>
-        </w:tc>
-        <w:tc>
-          <w:tcPr>
-            <w:tcW w:type="dxa" w:w="2520"/>
-            <w:shd w:fill="FFFFFF" w:val="clear"/>
-          </w:tcPr>
-          <w:p>
-            <w:r>
-              <w:rPr>
-                <w:rFonts w:ascii="Calibri" w:hAnsi="Calibri"/>
-                <w:b w:val="0"/>
-                <w:i w:val="0"/>
-                <w:color w:val="111827"/>
-                <w:sz w:val="20"/>
-              </w:rPr>
-              <w:t>3</w:t>
-            </w:r>
-          </w:p>
-        </w:tc>
-        <w:tc>
-          <w:tcPr>
-            <w:tcW w:type="dxa" w:w="2520"/>
-            <w:shd w:fill="FFFFFF" w:val="clear"/>
-          </w:tcPr>
-          <w:p>
-            <w:r>
-              <w:rPr>
-                <w:rFonts w:ascii="Calibri" w:hAnsi="Calibri"/>
-                <w:b w:val="0"/>
-                <w:i w:val="0"/>
-                <w:color w:val="111827"/>
-                <w:sz w:val="20"/>
-              </w:rPr>
-              <w:t>Junction</w:t>
-            </w:r>
-          </w:p>
-        </w:tc>
-        <w:tc>
-          <w:tcPr>
-            <w:tcW w:type="dxa" w:w="2520"/>
-            <w:shd w:fill="FFFFFF" w:val="clear"/>
-          </w:tcPr>
-          <w:p>
-            <w:r>
-              <w:rPr>
-                <w:rFonts w:ascii="Calibri" w:hAnsi="Calibri"/>
-                <w:b w:val="0"/>
-                <w:i w:val="0"/>
-                <w:color w:val="111827"/>
-                <w:sz w:val="20"/>
-              </w:rPr>
-              <w:t>User ↔ Team ↔ Organization</w:t>
-            </w:r>
-          </w:p>
-        </w:tc>
-      </w:tr>
-      <w:tr>
-        <w:tc>
-          <w:tcPr>
-            <w:tcW w:type="dxa" w:w="2520"/>
-            <w:shd w:fill="F9FAFB" w:val="clear"/>
-          </w:tcPr>
-          <w:p>
-            <w:r>
-              <w:rPr>
-                <w:rFonts w:ascii="Calibri" w:hAnsi="Calibri"/>
-                <w:b w:val="0"/>
-                <w:i w:val="0"/>
-                <w:color w:val="111827"/>
-                <w:sz w:val="20"/>
-              </w:rPr>
-              <w:t>Organization Team</w:t>
-            </w:r>
-          </w:p>
-        </w:tc>
-        <w:tc>
-          <w:tcPr>
-            <w:tcW w:type="dxa" w:w="2520"/>
-            <w:shd w:fill="F9FAFB" w:val="clear"/>
-          </w:tcPr>
-          <w:p>
-            <w:r>
-              <w:rPr>
-                <w:rFonts w:ascii="Calibri" w:hAnsi="Calibri"/>
-                <w:b w:val="0"/>
-                <w:i w:val="0"/>
-                <w:color w:val="111827"/>
-                <w:sz w:val="20"/>
-              </w:rPr>
-              <w:t>2</w:t>
-            </w:r>
-          </w:p>
-        </w:tc>
-        <w:tc>
-          <w:tcPr>
-            <w:tcW w:type="dxa" w:w="2520"/>
-            <w:shd w:fill="F9FAFB" w:val="clear"/>
-          </w:tcPr>
-          <w:p>
-            <w:r>
-              <w:rPr>
-                <w:rFonts w:ascii="Calibri" w:hAnsi="Calibri"/>
-                <w:b w:val="0"/>
-                <w:i w:val="0"/>
-                <w:color w:val="111827"/>
-                <w:sz w:val="20"/>
-              </w:rPr>
-              <w:t>Junction</w:t>
-            </w:r>
-          </w:p>
-        </w:tc>
-        <w:tc>
-          <w:tcPr>
-            <w:tcW w:type="dxa" w:w="2520"/>
-            <w:shd w:fill="F9FAFB" w:val="clear"/>
-          </w:tcPr>
-          <w:p>
-            <w:r>
-              <w:rPr>
-                <w:rFonts w:ascii="Calibri" w:hAnsi="Calibri"/>
-                <w:b w:val="0"/>
-                <w:i w:val="0"/>
-                <w:color w:val="111827"/>
-                <w:sz w:val="20"/>
-              </w:rPr>
-              <w:t>Organization ↔ Team</w:t>
-            </w:r>
-          </w:p>
-        </w:tc>
-      </w:tr>
-      <w:tr>
-        <w:tc>
-          <w:tcPr>
-            <w:tcW w:type="dxa" w:w="2520"/>
-            <w:shd w:fill="FFFFFF" w:val="clear"/>
-          </w:tcPr>
-          <w:p>
-            <w:r>
-              <w:rPr>
-                <w:rFonts w:ascii="Calibri" w:hAnsi="Calibri"/>
-                <w:b w:val="0"/>
-                <w:i w:val="0"/>
-                <w:color w:val="111827"/>
-                <w:sz w:val="20"/>
-              </w:rPr>
-              <w:t>Organization Application</w:t>
-            </w:r>
-          </w:p>
-        </w:tc>
-        <w:tc>
-          <w:tcPr>
-            <w:tcW w:type="dxa" w:w="2520"/>
-            <w:shd w:fill="FFFFFF" w:val="clear"/>
-          </w:tcPr>
-          <w:p>
-            <w:r>
-              <w:rPr>
-                <w:rFonts w:ascii="Calibri" w:hAnsi="Calibri"/>
-                <w:b w:val="0"/>
-                <w:i w:val="0"/>
-                <w:color w:val="111827"/>
-                <w:sz w:val="20"/>
-              </w:rPr>
-              <w:t>2</w:t>
-            </w:r>
-          </w:p>
-        </w:tc>
-        <w:tc>
-          <w:tcPr>
-            <w:tcW w:type="dxa" w:w="2520"/>
-            <w:shd w:fill="FFFFFF" w:val="clear"/>
-          </w:tcPr>
-          <w:p>
-            <w:r>
-              <w:rPr>
-                <w:rFonts w:ascii="Calibri" w:hAnsi="Calibri"/>
-                <w:b w:val="0"/>
-                <w:i w:val="0"/>
-                <w:color w:val="111827"/>
-                <w:sz w:val="20"/>
-              </w:rPr>
-              <w:t>Junction</w:t>
-            </w:r>
-          </w:p>
-        </w:tc>
-        <w:tc>
-          <w:tcPr>
-            <w:tcW w:type="dxa" w:w="2520"/>
-            <w:shd w:fill="FFFFFF" w:val="clear"/>
-          </w:tcPr>
-          <w:p>
-            <w:r>
-              <w:rPr>
-                <w:rFonts w:ascii="Calibri" w:hAnsi="Calibri"/>
-                <w:b w:val="0"/>
-                <w:i w:val="0"/>
-                <w:color w:val="111827"/>
-                <w:sz w:val="20"/>
-              </w:rPr>
-              <w:t>Organization ↔ Application</w:t>
-            </w:r>
-          </w:p>
-        </w:tc>
-      </w:tr>
-      <w:tr>
-        <w:tc>
-          <w:tcPr>
-            <w:tcW w:type="dxa" w:w="2520"/>
+            <w:tcW w:type="dxa" w:w="3360"/>
             <w:shd w:fill="F9FAFB" w:val="clear"/>
           </w:tcPr>
           <w:p>
@@ -1821,7 +1891,7 @@
         </w:tc>
         <w:tc>
           <w:tcPr>
-            <w:tcW w:type="dxa" w:w="2520"/>
+            <w:tcW w:type="dxa" w:w="3360"/>
             <w:shd w:fill="F9FAFB" w:val="clear"/>
           </w:tcPr>
           <w:p>
@@ -1833,13 +1903,13 @@
                 <w:color w:val="111827"/>
                 <w:sz w:val="20"/>
               </w:rPr>
-              <w:t>3</w:t>
+              <w:t>→ Task Request, User, Event Type; owns Reply Thread</w:t>
             </w:r>
           </w:p>
         </w:tc>
         <w:tc>
           <w:tcPr>
-            <w:tcW w:type="dxa" w:w="2520"/>
+            <w:tcW w:type="dxa" w:w="3360"/>
             <w:shd w:fill="F9FAFB" w:val="clear"/>
           </w:tcPr>
           <w:p>
@@ -1851,25 +1921,7 @@
                 <w:color w:val="111827"/>
                 <w:sz w:val="20"/>
               </w:rPr>
-              <w:t>Audit</w:t>
-            </w:r>
-          </w:p>
-        </w:tc>
-        <w:tc>
-          <w:tcPr>
-            <w:tcW w:type="dxa" w:w="2520"/>
-            <w:shd w:fill="F9FAFB" w:val="clear"/>
-          </w:tcPr>
-          <w:p>
-            <w:r>
-              <w:rPr>
-                <w:rFonts w:ascii="Calibri" w:hAnsi="Calibri"/>
-                <w:b w:val="0"/>
-                <w:i w:val="0"/>
-                <w:color w:val="111827"/>
-                <w:sz w:val="20"/>
-              </w:rPr>
-              <w:t>Business events on a request</w:t>
+              <w:t>Business events on a request (audit)</w:t>
             </w:r>
           </w:p>
         </w:tc>
@@ -1877,7 +1929,7 @@
       <w:tr>
         <w:tc>
           <w:tcPr>
-            <w:tcW w:type="dxa" w:w="2520"/>
+            <w:tcW w:type="dxa" w:w="3360"/>
             <w:shd w:fill="FFFFFF" w:val="clear"/>
           </w:tcPr>
           <w:p>
@@ -1895,7 +1947,7 @@
         </w:tc>
         <w:tc>
           <w:tcPr>
-            <w:tcW w:type="dxa" w:w="2520"/>
+            <w:tcW w:type="dxa" w:w="3360"/>
             <w:shd w:fill="FFFFFF" w:val="clear"/>
           </w:tcPr>
           <w:p>
@@ -1907,13 +1959,13 @@
                 <w:color w:val="111827"/>
                 <w:sz w:val="20"/>
               </w:rPr>
-              <w:t>2</w:t>
+              <w:t>→ Event History, User</w:t>
             </w:r>
           </w:p>
         </w:tc>
         <w:tc>
           <w:tcPr>
-            <w:tcW w:type="dxa" w:w="2520"/>
+            <w:tcW w:type="dxa" w:w="3360"/>
             <w:shd w:fill="FFFFFF" w:val="clear"/>
           </w:tcPr>
           <w:p>
@@ -1925,25 +1977,7 @@
                 <w:color w:val="111827"/>
                 <w:sz w:val="20"/>
               </w:rPr>
-              <w:t>Audit</w:t>
-            </w:r>
-          </w:p>
-        </w:tc>
-        <w:tc>
-          <w:tcPr>
-            <w:tcW w:type="dxa" w:w="2520"/>
-            <w:shd w:fill="FFFFFF" w:val="clear"/>
-          </w:tcPr>
-          <w:p>
-            <w:r>
-              <w:rPr>
-                <w:rFonts w:ascii="Calibri" w:hAnsi="Calibri"/>
-                <w:b w:val="0"/>
-                <w:i w:val="0"/>
-                <w:color w:val="111827"/>
-                <w:sz w:val="20"/>
-              </w:rPr>
-              <w:t>Threaded replies on request events</w:t>
+              <w:t>Threaded comments on request events</w:t>
             </w:r>
           </w:p>
         </w:tc>
@@ -1951,7 +1985,7 @@
       <w:tr>
         <w:tc>
           <w:tcPr>
-            <w:tcW w:type="dxa" w:w="2520"/>
+            <w:tcW w:type="dxa" w:w="3360"/>
             <w:shd w:fill="F9FAFB" w:val="clear"/>
           </w:tcPr>
           <w:p>
@@ -1969,7 +2003,7 @@
         </w:tc>
         <w:tc>
           <w:tcPr>
-            <w:tcW w:type="dxa" w:w="2520"/>
+            <w:tcW w:type="dxa" w:w="3360"/>
             <w:shd w:fill="F9FAFB" w:val="clear"/>
           </w:tcPr>
           <w:p>
@@ -1981,13 +2015,13 @@
                 <w:color w:val="111827"/>
                 <w:sz w:val="20"/>
               </w:rPr>
-              <w:t>2</w:t>
+              <w:t>→ Task Request, User</w:t>
             </w:r>
           </w:p>
         </w:tc>
         <w:tc>
           <w:tcPr>
-            <w:tcW w:type="dxa" w:w="2520"/>
+            <w:tcW w:type="dxa" w:w="3360"/>
             <w:shd w:fill="F9FAFB" w:val="clear"/>
           </w:tcPr>
           <w:p>
@@ -1999,13 +2033,71 @@
                 <w:color w:val="111827"/>
                 <w:sz w:val="20"/>
               </w:rPr>
-              <w:t>Audit</w:t>
+              <w:t>Users following a request</w:t>
+            </w:r>
+          </w:p>
+        </w:tc>
+      </w:tr>
+      <w:tr>
+        <w:tc>
+          <w:tcPr>
+            <w:tcW w:type="dxa" w:w="3360"/>
+            <w:shd w:fill="FFFFFF" w:val="clear"/>
+          </w:tcPr>
+          <w:p>
+            <w:r>
+              <w:rPr>
+                <w:rFonts w:ascii="Calibri" w:hAnsi="Calibri"/>
+                <w:b w:val="0"/>
+                <w:i w:val="0"/>
+                <w:color w:val="111827"/>
+                <w:sz w:val="20"/>
+              </w:rPr>
+              <w:t>Task Request Event Type *(lookup)*</w:t>
             </w:r>
           </w:p>
         </w:tc>
         <w:tc>
           <w:tcPr>
-            <w:tcW w:type="dxa" w:w="2520"/>
+            <w:tcW w:type="dxa" w:w="3360"/>
+            <w:shd w:fill="FFFFFF" w:val="clear"/>
+          </w:tcPr>
+          <w:p>
+            <w:r>
+              <w:rPr>
+                <w:rFonts w:ascii="Calibri" w:hAnsi="Calibri"/>
+                <w:b w:val="0"/>
+                <w:i w:val="0"/>
+                <w:color w:val="111827"/>
+                <w:sz w:val="20"/>
+              </w:rPr>
+              <w:t>—</w:t>
+            </w:r>
+          </w:p>
+        </w:tc>
+        <w:tc>
+          <w:tcPr>
+            <w:tcW w:type="dxa" w:w="3360"/>
+            <w:shd w:fill="FFFFFF" w:val="clear"/>
+          </w:tcPr>
+          <w:p>
+            <w:r>
+              <w:rPr>
+                <w:rFonts w:ascii="Calibri" w:hAnsi="Calibri"/>
+                <w:b w:val="0"/>
+                <w:i w:val="0"/>
+                <w:color w:val="111827"/>
+                <w:sz w:val="20"/>
+              </w:rPr>
+              <w:t>Event-type labels for requests</w:t>
+            </w:r>
+          </w:p>
+        </w:tc>
+      </w:tr>
+      <w:tr>
+        <w:tc>
+          <w:tcPr>
+            <w:tcW w:type="dxa" w:w="3360"/>
             <w:shd w:fill="F9FAFB" w:val="clear"/>
           </w:tcPr>
           <w:p>
@@ -2017,7 +2109,43 @@
                 <w:color w:val="111827"/>
                 <w:sz w:val="20"/>
               </w:rPr>
-              <w:t>Users subscribed to a request</w:t>
+              <w:t>Task Team Event History</w:t>
+            </w:r>
+          </w:p>
+        </w:tc>
+        <w:tc>
+          <w:tcPr>
+            <w:tcW w:type="dxa" w:w="3360"/>
+            <w:shd w:fill="F9FAFB" w:val="clear"/>
+          </w:tcPr>
+          <w:p>
+            <w:r>
+              <w:rPr>
+                <w:rFonts w:ascii="Calibri" w:hAnsi="Calibri"/>
+                <w:b w:val="0"/>
+                <w:i w:val="0"/>
+                <w:color w:val="111827"/>
+                <w:sz w:val="20"/>
+              </w:rPr>
+              <w:t>→ Team, User, Event Type; owns Reply Thread</w:t>
+            </w:r>
+          </w:p>
+        </w:tc>
+        <w:tc>
+          <w:tcPr>
+            <w:tcW w:type="dxa" w:w="3360"/>
+            <w:shd w:fill="F9FAFB" w:val="clear"/>
+          </w:tcPr>
+          <w:p>
+            <w:r>
+              <w:rPr>
+                <w:rFonts w:ascii="Calibri" w:hAnsi="Calibri"/>
+                <w:b w:val="0"/>
+                <w:i w:val="0"/>
+                <w:color w:val="111827"/>
+                <w:sz w:val="20"/>
+              </w:rPr>
+              <w:t>Business events on a team (audit)</w:t>
             </w:r>
           </w:p>
         </w:tc>
@@ -2025,7 +2153,7 @@
       <w:tr>
         <w:tc>
           <w:tcPr>
-            <w:tcW w:type="dxa" w:w="2520"/>
+            <w:tcW w:type="dxa" w:w="3360"/>
             <w:shd w:fill="FFFFFF" w:val="clear"/>
           </w:tcPr>
           <w:p>
@@ -2037,13 +2165,13 @@
                 <w:color w:val="111827"/>
                 <w:sz w:val="20"/>
               </w:rPr>
-              <w:t>Task Team Event History / Reply Thread / Subscriber</w:t>
+              <w:t>Task Team Reply Thread</w:t>
             </w:r>
           </w:p>
         </w:tc>
         <w:tc>
           <w:tcPr>
-            <w:tcW w:type="dxa" w:w="2520"/>
+            <w:tcW w:type="dxa" w:w="3360"/>
             <w:shd w:fill="FFFFFF" w:val="clear"/>
           </w:tcPr>
           <w:p>
@@ -2055,13 +2183,13 @@
                 <w:color w:val="111827"/>
                 <w:sz w:val="20"/>
               </w:rPr>
-              <w:t>2–3 each</w:t>
+              <w:t>→ Event History, User</w:t>
             </w:r>
           </w:p>
         </w:tc>
         <w:tc>
           <w:tcPr>
-            <w:tcW w:type="dxa" w:w="2520"/>
+            <w:tcW w:type="dxa" w:w="3360"/>
             <w:shd w:fill="FFFFFF" w:val="clear"/>
           </w:tcPr>
           <w:p>
@@ -2073,13 +2201,71 @@
                 <w:color w:val="111827"/>
                 <w:sz w:val="20"/>
               </w:rPr>
-              <w:t>Audit</w:t>
+              <w:t>Threaded comments on team events</w:t>
+            </w:r>
+          </w:p>
+        </w:tc>
+      </w:tr>
+      <w:tr>
+        <w:tc>
+          <w:tcPr>
+            <w:tcW w:type="dxa" w:w="3360"/>
+            <w:shd w:fill="F9FAFB" w:val="clear"/>
+          </w:tcPr>
+          <w:p>
+            <w:r>
+              <w:rPr>
+                <w:rFonts w:ascii="Calibri" w:hAnsi="Calibri"/>
+                <w:b w:val="0"/>
+                <w:i w:val="0"/>
+                <w:color w:val="111827"/>
+                <w:sz w:val="20"/>
+              </w:rPr>
+              <w:t>Task Team Subscriber</w:t>
             </w:r>
           </w:p>
         </w:tc>
         <w:tc>
           <w:tcPr>
-            <w:tcW w:type="dxa" w:w="2520"/>
+            <w:tcW w:type="dxa" w:w="3360"/>
+            <w:shd w:fill="F9FAFB" w:val="clear"/>
+          </w:tcPr>
+          <w:p>
+            <w:r>
+              <w:rPr>
+                <w:rFonts w:ascii="Calibri" w:hAnsi="Calibri"/>
+                <w:b w:val="0"/>
+                <w:i w:val="0"/>
+                <w:color w:val="111827"/>
+                <w:sz w:val="20"/>
+              </w:rPr>
+              <w:t>→ Team, User</w:t>
+            </w:r>
+          </w:p>
+        </w:tc>
+        <w:tc>
+          <w:tcPr>
+            <w:tcW w:type="dxa" w:w="3360"/>
+            <w:shd w:fill="F9FAFB" w:val="clear"/>
+          </w:tcPr>
+          <w:p>
+            <w:r>
+              <w:rPr>
+                <w:rFonts w:ascii="Calibri" w:hAnsi="Calibri"/>
+                <w:b w:val="0"/>
+                <w:i w:val="0"/>
+                <w:color w:val="111827"/>
+                <w:sz w:val="20"/>
+              </w:rPr>
+              <w:t>Users following a team</w:t>
+            </w:r>
+          </w:p>
+        </w:tc>
+      </w:tr>
+      <w:tr>
+        <w:tc>
+          <w:tcPr>
+            <w:tcW w:type="dxa" w:w="3360"/>
             <w:shd w:fill="FFFFFF" w:val="clear"/>
           </w:tcPr>
           <w:p>
@@ -2091,7 +2277,43 @@
                 <w:color w:val="111827"/>
                 <w:sz w:val="20"/>
               </w:rPr>
-              <w:t>Parallel audit sub-model for team events</w:t>
+              <w:t>Task Team Event Type *(lookup)*</w:t>
+            </w:r>
+          </w:p>
+        </w:tc>
+        <w:tc>
+          <w:tcPr>
+            <w:tcW w:type="dxa" w:w="3360"/>
+            <w:shd w:fill="FFFFFF" w:val="clear"/>
+          </w:tcPr>
+          <w:p>
+            <w:r>
+              <w:rPr>
+                <w:rFonts w:ascii="Calibri" w:hAnsi="Calibri"/>
+                <w:b w:val="0"/>
+                <w:i w:val="0"/>
+                <w:color w:val="111827"/>
+                <w:sz w:val="20"/>
+              </w:rPr>
+              <w:t>—</w:t>
+            </w:r>
+          </w:p>
+        </w:tc>
+        <w:tc>
+          <w:tcPr>
+            <w:tcW w:type="dxa" w:w="3360"/>
+            <w:shd w:fill="FFFFFF" w:val="clear"/>
+          </w:tcPr>
+          <w:p>
+            <w:r>
+              <w:rPr>
+                <w:rFonts w:ascii="Calibri" w:hAnsi="Calibri"/>
+                <w:b w:val="0"/>
+                <w:i w:val="0"/>
+                <w:color w:val="111827"/>
+                <w:sz w:val="20"/>
+              </w:rPr>
+              <w:t>Event-type labels for team events</w:t>
             </w:r>
           </w:p>
         </w:tc>
@@ -2099,7 +2321,7 @@
       <w:tr>
         <w:tc>
           <w:tcPr>
-            <w:tcW w:type="dxa" w:w="2520"/>
+            <w:tcW w:type="dxa" w:w="3360"/>
             <w:shd w:fill="F9FAFB" w:val="clear"/>
           </w:tcPr>
           <w:p>
@@ -2111,13 +2333,13 @@
                 <w:color w:val="111827"/>
                 <w:sz w:val="20"/>
               </w:rPr>
-              <w:t>Task Request/Team Event Type</w:t>
+              <w:t>Task Status *(lookup)*</w:t>
             </w:r>
           </w:p>
         </w:tc>
         <w:tc>
           <w:tcPr>
-            <w:tcW w:type="dxa" w:w="2520"/>
+            <w:tcW w:type="dxa" w:w="3360"/>
             <w:shd w:fill="F9FAFB" w:val="clear"/>
           </w:tcPr>
           <w:p>
@@ -2129,106 +2351,14 @@
                 <w:color w:val="111827"/>
                 <w:sz w:val="20"/>
               </w:rPr>
-              <w:t>1 (in)</w:t>
+              <w:t>—</w:t>
             </w:r>
           </w:p>
         </w:tc>
         <w:tc>
           <w:tcPr>
-            <w:tcW w:type="dxa" w:w="2520"/>
+            <w:tcW w:type="dxa" w:w="3360"/>
             <w:shd w:fill="F9FAFB" w:val="clear"/>
-          </w:tcPr>
-          <w:p>
-            <w:r>
-              <w:rPr>
-                <w:rFonts w:ascii="Calibri" w:hAnsi="Calibri"/>
-                <w:b w:val="0"/>
-                <w:i w:val="0"/>
-                <w:color w:val="111827"/>
-                <w:sz w:val="20"/>
-              </w:rPr>
-              <w:t>Lookup</w:t>
-            </w:r>
-          </w:p>
-        </w:tc>
-        <w:tc>
-          <w:tcPr>
-            <w:tcW w:type="dxa" w:w="2520"/>
-            <w:shd w:fill="F9FAFB" w:val="clear"/>
-          </w:tcPr>
-          <w:p>
-            <w:r>
-              <w:rPr>
-                <w:rFonts w:ascii="Calibri" w:hAnsi="Calibri"/>
-                <w:b w:val="0"/>
-                <w:i w:val="0"/>
-                <w:color w:val="111827"/>
-                <w:sz w:val="20"/>
-              </w:rPr>
-              <w:t>Event-type enumerations</w:t>
-            </w:r>
-          </w:p>
-        </w:tc>
-      </w:tr>
-      <w:tr>
-        <w:tc>
-          <w:tcPr>
-            <w:tcW w:type="dxa" w:w="2520"/>
-            <w:shd w:fill="FFFFFF" w:val="clear"/>
-          </w:tcPr>
-          <w:p>
-            <w:r>
-              <w:rPr>
-                <w:rFonts w:ascii="Calibri" w:hAnsi="Calibri"/>
-                <w:b w:val="0"/>
-                <w:i w:val="0"/>
-                <w:color w:val="111827"/>
-                <w:sz w:val="20"/>
-              </w:rPr>
-              <w:t>Task Status</w:t>
-            </w:r>
-          </w:p>
-        </w:tc>
-        <w:tc>
-          <w:tcPr>
-            <w:tcW w:type="dxa" w:w="2520"/>
-            <w:shd w:fill="FFFFFF" w:val="clear"/>
-          </w:tcPr>
-          <w:p>
-            <w:r>
-              <w:rPr>
-                <w:rFonts w:ascii="Calibri" w:hAnsi="Calibri"/>
-                <w:b w:val="0"/>
-                <w:i w:val="0"/>
-                <w:color w:val="111827"/>
-                <w:sz w:val="20"/>
-              </w:rPr>
-              <w:t>1 (in)</w:t>
-            </w:r>
-          </w:p>
-        </w:tc>
-        <w:tc>
-          <w:tcPr>
-            <w:tcW w:type="dxa" w:w="2520"/>
-            <w:shd w:fill="FFFFFF" w:val="clear"/>
-          </w:tcPr>
-          <w:p>
-            <w:r>
-              <w:rPr>
-                <w:rFonts w:ascii="Calibri" w:hAnsi="Calibri"/>
-                <w:b w:val="0"/>
-                <w:i w:val="0"/>
-                <w:color w:val="111827"/>
-                <w:sz w:val="20"/>
-              </w:rPr>
-              <w:t>Lookup</w:t>
-            </w:r>
-          </w:p>
-        </w:tc>
-        <w:tc>
-          <w:tcPr>
-            <w:tcW w:type="dxa" w:w="2520"/>
-            <w:shd w:fill="FFFFFF" w:val="clear"/>
           </w:tcPr>
           <w:p>
             <w:r>
@@ -2247,8 +2377,8 @@
       <w:tr>
         <w:tc>
           <w:tcPr>
-            <w:tcW w:type="dxa" w:w="2520"/>
-            <w:shd w:fill="F9FAFB" w:val="clear"/>
+            <w:tcW w:type="dxa" w:w="3360"/>
+            <w:shd w:fill="FFFFFF" w:val="clear"/>
           </w:tcPr>
           <w:p>
             <w:r>
@@ -2259,14 +2389,14 @@
                 <w:color w:val="111827"/>
                 <w:sz w:val="20"/>
               </w:rPr>
-              <w:t>Task Definiation</w:t>
+              <w:t>Task Definiation *(lookup)*</w:t>
             </w:r>
           </w:p>
         </w:tc>
         <w:tc>
           <w:tcPr>
-            <w:tcW w:type="dxa" w:w="2520"/>
-            <w:shd w:fill="F9FAFB" w:val="clear"/>
+            <w:tcW w:type="dxa" w:w="3360"/>
+            <w:shd w:fill="FFFFFF" w:val="clear"/>
           </w:tcPr>
           <w:p>
             <w:r>
@@ -2277,32 +2407,14 @@
                 <w:color w:val="111827"/>
                 <w:sz w:val="20"/>
               </w:rPr>
-              <w:t>1 (in)</w:t>
+              <w:t>—</w:t>
             </w:r>
           </w:p>
         </w:tc>
         <w:tc>
           <w:tcPr>
-            <w:tcW w:type="dxa" w:w="2520"/>
-            <w:shd w:fill="F9FAFB" w:val="clear"/>
-          </w:tcPr>
-          <w:p>
-            <w:r>
-              <w:rPr>
-                <w:rFonts w:ascii="Calibri" w:hAnsi="Calibri"/>
-                <w:b w:val="0"/>
-                <w:i w:val="0"/>
-                <w:color w:val="111827"/>
-                <w:sz w:val="20"/>
-              </w:rPr>
-              <w:t>Lookup</w:t>
-            </w:r>
-          </w:p>
-        </w:tc>
-        <w:tc>
-          <w:tcPr>
-            <w:tcW w:type="dxa" w:w="2520"/>
-            <w:shd w:fill="F9FAFB" w:val="clear"/>
+            <w:tcW w:type="dxa" w:w="3360"/>
+            <w:shd w:fill="FFFFFF" w:val="clear"/>
           </w:tcPr>
           <w:p>
             <w:r>
@@ -2321,7 +2433,63 @@
       <w:tr>
         <w:tc>
           <w:tcPr>
-            <w:tcW w:type="dxa" w:w="2520"/>
+            <w:tcW w:type="dxa" w:w="3360"/>
+            <w:shd w:fill="F9FAFB" w:val="clear"/>
+          </w:tcPr>
+          <w:p>
+            <w:r>
+              <w:rPr>
+                <w:rFonts w:ascii="Calibri" w:hAnsi="Calibri"/>
+                <w:b w:val="0"/>
+                <w:i w:val="0"/>
+                <w:color w:val="111827"/>
+                <w:sz w:val="20"/>
+              </w:rPr>
+              <w:t>Team Manage</w:t>
+            </w:r>
+          </w:p>
+        </w:tc>
+        <w:tc>
+          <w:tcPr>
+            <w:tcW w:type="dxa" w:w="3360"/>
+            <w:shd w:fill="F9FAFB" w:val="clear"/>
+          </w:tcPr>
+          <w:p>
+            <w:r>
+              <w:rPr>
+                <w:rFonts w:ascii="Calibri" w:hAnsi="Calibri"/>
+                <w:b w:val="0"/>
+                <w:i w:val="0"/>
+                <w:color w:val="111827"/>
+                <w:sz w:val="20"/>
+              </w:rPr>
+              <w:t>—</w:t>
+            </w:r>
+          </w:p>
+        </w:tc>
+        <w:tc>
+          <w:tcPr>
+            <w:tcW w:type="dxa" w:w="3360"/>
+            <w:shd w:fill="F9FAFB" w:val="clear"/>
+          </w:tcPr>
+          <w:p>
+            <w:r>
+              <w:rPr>
+                <w:rFonts w:ascii="Calibri" w:hAnsi="Calibri"/>
+                <w:b w:val="0"/>
+                <w:i w:val="0"/>
+                <w:color w:val="111827"/>
+                <w:sz w:val="20"/>
+              </w:rPr>
+              <w:t>Team-management associations</w:t>
+            </w:r>
+          </w:p>
+        </w:tc>
+      </w:tr>
+      <w:tr>
+        <w:tc>
+          <w:tcPr>
+            <w:tcW w:type="dxa" w:w="3360"/>
             <w:shd w:fill="FFFFFF" w:val="clear"/>
           </w:tcPr>
           <w:p>
@@ -2333,13 +2501,13 @@
                 <w:color w:val="111827"/>
                 <w:sz w:val="20"/>
               </w:rPr>
-              <w:t>Ref Country / Ref State / Ref City</w:t>
+              <w:t>Team Role *(see above)*</w:t>
             </w:r>
           </w:p>
         </w:tc>
         <w:tc>
           <w:tcPr>
-            <w:tcW w:type="dxa" w:w="2520"/>
+            <w:tcW w:type="dxa" w:w="3360"/>
             <w:shd w:fill="FFFFFF" w:val="clear"/>
           </w:tcPr>
           <w:p>
@@ -2351,13 +2519,13 @@
                 <w:color w:val="111827"/>
                 <w:sz w:val="20"/>
               </w:rPr>
-              <w:t>1 (in) each</w:t>
+              <w:t>→ Team, Group</w:t>
             </w:r>
           </w:p>
         </w:tc>
         <w:tc>
           <w:tcPr>
-            <w:tcW w:type="dxa" w:w="2520"/>
+            <w:tcW w:type="dxa" w:w="3360"/>
             <w:shd w:fill="FFFFFF" w:val="clear"/>
           </w:tcPr>
           <w:p>
@@ -2369,13 +2537,71 @@
                 <w:color w:val="111827"/>
                 <w:sz w:val="20"/>
               </w:rPr>
-              <w:t>Lookup</w:t>
+              <w:t>(listed above)</w:t>
+            </w:r>
+          </w:p>
+        </w:tc>
+      </w:tr>
+      <w:tr>
+        <w:tc>
+          <w:tcPr>
+            <w:tcW w:type="dxa" w:w="3360"/>
+            <w:shd w:fill="F9FAFB" w:val="clear"/>
+          </w:tcPr>
+          <w:p>
+            <w:r>
+              <w:rPr>
+                <w:rFonts w:ascii="Calibri" w:hAnsi="Calibri"/>
+                <w:b w:val="0"/>
+                <w:i w:val="0"/>
+                <w:color w:val="111827"/>
+                <w:sz w:val="20"/>
+              </w:rPr>
+              <w:t>Ref Country *(lookup)*</w:t>
             </w:r>
           </w:p>
         </w:tc>
         <w:tc>
           <w:tcPr>
-            <w:tcW w:type="dxa" w:w="2520"/>
+            <w:tcW w:type="dxa" w:w="3360"/>
+            <w:shd w:fill="F9FAFB" w:val="clear"/>
+          </w:tcPr>
+          <w:p>
+            <w:r>
+              <w:rPr>
+                <w:rFonts w:ascii="Calibri" w:hAnsi="Calibri"/>
+                <w:b w:val="0"/>
+                <w:i w:val="0"/>
+                <w:color w:val="111827"/>
+                <w:sz w:val="20"/>
+              </w:rPr>
+              <w:t>—</w:t>
+            </w:r>
+          </w:p>
+        </w:tc>
+        <w:tc>
+          <w:tcPr>
+            <w:tcW w:type="dxa" w:w="3360"/>
+            <w:shd w:fill="F9FAFB" w:val="clear"/>
+          </w:tcPr>
+          <w:p>
+            <w:r>
+              <w:rPr>
+                <w:rFonts w:ascii="Calibri" w:hAnsi="Calibri"/>
+                <w:b w:val="0"/>
+                <w:i w:val="0"/>
+                <w:color w:val="111827"/>
+                <w:sz w:val="20"/>
+              </w:rPr>
+              <w:t>Country reference data</w:t>
+            </w:r>
+          </w:p>
+        </w:tc>
+      </w:tr>
+      <w:tr>
+        <w:tc>
+          <w:tcPr>
+            <w:tcW w:type="dxa" w:w="3360"/>
             <w:shd w:fill="FFFFFF" w:val="clear"/>
           </w:tcPr>
           <w:p>
@@ -2387,7 +2613,43 @@
                 <w:color w:val="111827"/>
                 <w:sz w:val="20"/>
               </w:rPr>
-              <w:t>Geographic reference data</w:t>
+              <w:t>Ref State *(lookup)*</w:t>
+            </w:r>
+          </w:p>
+        </w:tc>
+        <w:tc>
+          <w:tcPr>
+            <w:tcW w:type="dxa" w:w="3360"/>
+            <w:shd w:fill="FFFFFF" w:val="clear"/>
+          </w:tcPr>
+          <w:p>
+            <w:r>
+              <w:rPr>
+                <w:rFonts w:ascii="Calibri" w:hAnsi="Calibri"/>
+                <w:b w:val="0"/>
+                <w:i w:val="0"/>
+                <w:color w:val="111827"/>
+                <w:sz w:val="20"/>
+              </w:rPr>
+              <w:t>—</w:t>
+            </w:r>
+          </w:p>
+        </w:tc>
+        <w:tc>
+          <w:tcPr>
+            <w:tcW w:type="dxa" w:w="3360"/>
+            <w:shd w:fill="FFFFFF" w:val="clear"/>
+          </w:tcPr>
+          <w:p>
+            <w:r>
+              <w:rPr>
+                <w:rFonts w:ascii="Calibri" w:hAnsi="Calibri"/>
+                <w:b w:val="0"/>
+                <w:i w:val="0"/>
+                <w:color w:val="111827"/>
+                <w:sz w:val="20"/>
+              </w:rPr>
+              <w:t>State reference data</w:t>
             </w:r>
           </w:p>
         </w:tc>
@@ -2395,7 +2657,7 @@
       <w:tr>
         <w:tc>
           <w:tcPr>
-            <w:tcW w:type="dxa" w:w="2520"/>
+            <w:tcW w:type="dxa" w:w="3360"/>
             <w:shd w:fill="F9FAFB" w:val="clear"/>
           </w:tcPr>
           <w:p>
@@ -2407,13 +2669,13 @@
                 <w:color w:val="111827"/>
                 <w:sz w:val="20"/>
               </w:rPr>
-              <w:t>Ref Role</w:t>
+              <w:t>Ref City *(lookup)*</w:t>
             </w:r>
           </w:p>
         </w:tc>
         <w:tc>
           <w:tcPr>
-            <w:tcW w:type="dxa" w:w="2520"/>
+            <w:tcW w:type="dxa" w:w="3360"/>
             <w:shd w:fill="F9FAFB" w:val="clear"/>
           </w:tcPr>
           <w:p>
@@ -2425,13 +2687,13 @@
                 <w:color w:val="111827"/>
                 <w:sz w:val="20"/>
               </w:rPr>
-              <w:t>1 (in)</w:t>
+              <w:t>—</w:t>
             </w:r>
           </w:p>
         </w:tc>
         <w:tc>
           <w:tcPr>
-            <w:tcW w:type="dxa" w:w="2520"/>
+            <w:tcW w:type="dxa" w:w="3360"/>
             <w:shd w:fill="F9FAFB" w:val="clear"/>
           </w:tcPr>
           <w:p>
@@ -2443,14 +2705,52 @@
                 <w:color w:val="111827"/>
                 <w:sz w:val="20"/>
               </w:rPr>
-              <w:t>Lookup</w:t>
+              <w:t>City reference data</w:t>
+            </w:r>
+          </w:p>
+        </w:tc>
+      </w:tr>
+      <w:tr>
+        <w:tc>
+          <w:tcPr>
+            <w:tcW w:type="dxa" w:w="3360"/>
+            <w:shd w:fill="FFFFFF" w:val="clear"/>
+          </w:tcPr>
+          <w:p>
+            <w:r>
+              <w:rPr>
+                <w:rFonts w:ascii="Calibri" w:hAnsi="Calibri"/>
+                <w:b w:val="0"/>
+                <w:i w:val="0"/>
+                <w:color w:val="111827"/>
+                <w:sz w:val="20"/>
+              </w:rPr>
+              <w:t>Ref Role *(lookup)*</w:t>
             </w:r>
           </w:p>
         </w:tc>
         <w:tc>
           <w:tcPr>
-            <w:tcW w:type="dxa" w:w="2520"/>
-            <w:shd w:fill="F9FAFB" w:val="clear"/>
+            <w:tcW w:type="dxa" w:w="3360"/>
+            <w:shd w:fill="FFFFFF" w:val="clear"/>
+          </w:tcPr>
+          <w:p>
+            <w:r>
+              <w:rPr>
+                <w:rFonts w:ascii="Calibri" w:hAnsi="Calibri"/>
+                <w:b w:val="0"/>
+                <w:i w:val="0"/>
+                <w:color w:val="111827"/>
+                <w:sz w:val="20"/>
+              </w:rPr>
+              <w:t>—</w:t>
+            </w:r>
+          </w:p>
+        </w:tc>
+        <w:tc>
+          <w:tcPr>
+            <w:tcW w:type="dxa" w:w="3360"/>
+            <w:shd w:fill="FFFFFF" w:val="clear"/>
           </w:tcPr>
           <w:p>
             <w:r>
@@ -2469,8 +2769,8 @@
       <w:tr>
         <w:tc>
           <w:tcPr>
-            <w:tcW w:type="dxa" w:w="2520"/>
-            <w:shd w:fill="FFFFFF" w:val="clear"/>
+            <w:tcW w:type="dxa" w:w="3360"/>
+            <w:shd w:fill="F9FAFB" w:val="clear"/>
           </w:tcPr>
           <w:p>
             <w:r>
@@ -2481,14 +2781,14 @@
                 <w:color w:val="111827"/>
                 <w:sz w:val="20"/>
               </w:rPr>
-              <w:t>Feedback Category</w:t>
+              <w:t>Feedback Category *(lookup)*</w:t>
             </w:r>
           </w:p>
         </w:tc>
         <w:tc>
           <w:tcPr>
-            <w:tcW w:type="dxa" w:w="2520"/>
-            <w:shd w:fill="FFFFFF" w:val="clear"/>
+            <w:tcW w:type="dxa" w:w="3360"/>
+            <w:shd w:fill="F9FAFB" w:val="clear"/>
           </w:tcPr>
           <w:p>
             <w:r>
@@ -2505,26 +2805,8 @@
         </w:tc>
         <w:tc>
           <w:tcPr>
-            <w:tcW w:type="dxa" w:w="2520"/>
-            <w:shd w:fill="FFFFFF" w:val="clear"/>
-          </w:tcPr>
-          <w:p>
-            <w:r>
-              <w:rPr>
-                <w:rFonts w:ascii="Calibri" w:hAnsi="Calibri"/>
-                <w:b w:val="0"/>
-                <w:i w:val="0"/>
-                <w:color w:val="111827"/>
-                <w:sz w:val="20"/>
-              </w:rPr>
-              <w:t>Lookup</w:t>
-            </w:r>
-          </w:p>
-        </w:tc>
-        <w:tc>
-          <w:tcPr>
-            <w:tcW w:type="dxa" w:w="2520"/>
-            <w:shd w:fill="FFFFFF" w:val="clear"/>
+            <w:tcW w:type="dxa" w:w="3360"/>
+            <w:shd w:fill="F9FAFB" w:val="clear"/>
           </w:tcPr>
           <w:p>
             <w:r>
@@ -2552,7 +2834,7 @@
           <w:color w:val="111827"/>
           <w:sz w:val="22"/>
         </w:rPr>
-        <w:t>*31 record types · 52 relationships. Entity boxes strip the `UAM` prefix for readability; the underlying records are `UAM &lt;Name&gt;` (note as-built spellings `Definiation`, `Hichearcy`). The diagram foregrounds the primary relationships; the full field-level detail per entity is in the [TDD](uat_1-tdd.md) §3–5.*</w:t>
+        <w:t>*Junction tables resolve the many-to-many memberships; lookup tables constrain and label data; the two Task audit chains provide an append-only history for compliance.*</w:t>
       </w:r>
     </w:p>
     <w:sectPr>

</xml_diff>